<commit_message>
feat( 2026-04-16_Projektdokumentation.docx) - added
</commit_message>
<xml_diff>
--- a/4.5_KomponentenTest_Worker.docx
+++ b/4.5_KomponentenTest_Worker.docx
@@ -4,7 +4,7 @@
   <w:body>
     <w:tbl>
       <w:tblPr>
-        <w:tblW w:w="0" w:type="auto"/>
+        <w:tblW w:w="9230" w:type="dxa"/>
         <w:tblBorders>
           <w:top w:val="single" w:sz="8" w:space="0" w:color="A3A3A3"/>
           <w:left w:val="single" w:sz="8" w:space="0" w:color="A3A3A3"/>
@@ -20,18 +20,18 @@
         <w:tblDescription w:val=""/>
       </w:tblPr>
       <w:tblGrid>
-        <w:gridCol w:w="384"/>
-        <w:gridCol w:w="624"/>
-        <w:gridCol w:w="1619"/>
-        <w:gridCol w:w="1308"/>
-        <w:gridCol w:w="1963"/>
-        <w:gridCol w:w="1744"/>
-        <w:gridCol w:w="1408"/>
+        <w:gridCol w:w="420"/>
+        <w:gridCol w:w="701"/>
+        <w:gridCol w:w="1862"/>
+        <w:gridCol w:w="1499"/>
+        <w:gridCol w:w="2263"/>
+        <w:gridCol w:w="2007"/>
+        <w:gridCol w:w="1616"/>
       </w:tblGrid>
       <w:tr>
         <w:tc>
           <w:tcPr>
-            <w:tcW w:w="960" w:type="dxa"/>
+            <w:tcW w:w="1008" w:type="dxa"/>
             <w:tcBorders>
               <w:top w:val="single" w:sz="8" w:space="0" w:color="A3A3A3"/>
               <w:left w:val="single" w:sz="8" w:space="0" w:color="A3A3A3"/>
@@ -69,7 +69,7 @@
         </w:tc>
         <w:tc>
           <w:tcPr>
-            <w:tcW w:w="989" w:type="dxa"/>
+            <w:tcW w:w="180" w:type="dxa"/>
             <w:tcBorders>
               <w:top w:val="single" w:sz="8" w:space="0" w:color="A3A3A3"/>
               <w:left w:val="single" w:sz="8" w:space="0" w:color="A3A3A3"/>
@@ -107,7 +107,7 @@
         </w:tc>
         <w:tc>
           <w:tcPr>
-            <w:tcW w:w="1344" w:type="dxa"/>
+            <w:tcW w:w="1619" w:type="dxa"/>
             <w:tcBorders>
               <w:top w:val="single" w:sz="8" w:space="0" w:color="A3A3A3"/>
               <w:left w:val="single" w:sz="8" w:space="0" w:color="A3A3A3"/>
@@ -145,7 +145,7 @@
         </w:tc>
         <w:tc>
           <w:tcPr>
-            <w:tcW w:w="1868" w:type="dxa"/>
+            <w:tcW w:w="1308" w:type="dxa"/>
             <w:tcBorders>
               <w:top w:val="single" w:sz="8" w:space="0" w:color="A3A3A3"/>
               <w:left w:val="single" w:sz="8" w:space="0" w:color="A3A3A3"/>
@@ -183,7 +183,7 @@
         </w:tc>
         <w:tc>
           <w:tcPr>
-            <w:tcW w:w="2284" w:type="dxa"/>
+            <w:tcW w:w="1963" w:type="dxa"/>
             <w:tcBorders>
               <w:top w:val="single" w:sz="8" w:space="0" w:color="A3A3A3"/>
               <w:left w:val="single" w:sz="8" w:space="0" w:color="A3A3A3"/>
@@ -221,7 +221,7 @@
         </w:tc>
         <w:tc>
           <w:tcPr>
-            <w:tcW w:w="3613" w:type="dxa"/>
+            <w:tcW w:w="1744" w:type="dxa"/>
             <w:tcBorders>
               <w:top w:val="single" w:sz="8" w:space="0" w:color="A3A3A3"/>
               <w:left w:val="single" w:sz="8" w:space="0" w:color="A3A3A3"/>
@@ -259,7 +259,7 @@
         </w:tc>
         <w:tc>
           <w:tcPr>
-            <w:tcW w:w="1986" w:type="dxa"/>
+            <w:tcW w:w="1408" w:type="dxa"/>
             <w:tcBorders>
               <w:top w:val="single" w:sz="8" w:space="0" w:color="A3A3A3"/>
               <w:left w:val="single" w:sz="8" w:space="0" w:color="A3A3A3"/>
@@ -299,7 +299,7 @@
       <w:tr>
         <w:tc>
           <w:tcPr>
-            <w:tcW w:w="988" w:type="dxa"/>
+            <w:tcW w:w="1008" w:type="dxa"/>
             <w:tcBorders>
               <w:top w:val="single" w:sz="8" w:space="0" w:color="A3A3A3"/>
               <w:left w:val="single" w:sz="8" w:space="0" w:color="A3A3A3"/>
@@ -337,7 +337,7 @@
         </w:tc>
         <w:tc>
           <w:tcPr>
-            <w:tcW w:w="989" w:type="dxa"/>
+            <w:tcW w:w="180" w:type="dxa"/>
             <w:tcBorders>
               <w:top w:val="single" w:sz="8" w:space="0" w:color="A3A3A3"/>
               <w:left w:val="single" w:sz="8" w:space="0" w:color="A3A3A3"/>
@@ -375,7 +375,7 @@
         </w:tc>
         <w:tc>
           <w:tcPr>
-            <w:tcW w:w="1359" w:type="dxa"/>
+            <w:tcW w:w="1619" w:type="dxa"/>
             <w:tcBorders>
               <w:top w:val="single" w:sz="8" w:space="0" w:color="A3A3A3"/>
               <w:left w:val="single" w:sz="8" w:space="0" w:color="A3A3A3"/>
@@ -425,7 +425,7 @@
         </w:tc>
         <w:tc>
           <w:tcPr>
-            <w:tcW w:w="1868" w:type="dxa"/>
+            <w:tcW w:w="1308" w:type="dxa"/>
             <w:tcBorders>
               <w:top w:val="single" w:sz="8" w:space="0" w:color="A3A3A3"/>
               <w:left w:val="single" w:sz="8" w:space="0" w:color="A3A3A3"/>
@@ -461,7 +461,7 @@
         </w:tc>
         <w:tc>
           <w:tcPr>
-            <w:tcW w:w="2255" w:type="dxa"/>
+            <w:tcW w:w="1963" w:type="dxa"/>
             <w:tcBorders>
               <w:top w:val="single" w:sz="8" w:space="0" w:color="A3A3A3"/>
               <w:left w:val="single" w:sz="8" w:space="0" w:color="A3A3A3"/>
@@ -497,7 +497,7 @@
         </w:tc>
         <w:tc>
           <w:tcPr>
-            <w:tcW w:w="3613" w:type="dxa"/>
+            <w:tcW w:w="1744" w:type="dxa"/>
             <w:tcBorders>
               <w:top w:val="single" w:sz="8" w:space="0" w:color="A3A3A3"/>
               <w:left w:val="single" w:sz="8" w:space="0" w:color="A3A3A3"/>
@@ -551,7 +551,7 @@
         </w:tc>
         <w:tc>
           <w:tcPr>
-            <w:tcW w:w="2667" w:type="dxa"/>
+            <w:tcW w:w="1408" w:type="dxa"/>
             <w:tcBorders>
               <w:top w:val="single" w:sz="8" w:space="0" w:color="A3A3A3"/>
               <w:left w:val="single" w:sz="8" w:space="0" w:color="A3A3A3"/>
@@ -589,7 +589,7 @@
       <w:tr>
         <w:tc>
           <w:tcPr>
-            <w:tcW w:w="988" w:type="dxa"/>
+            <w:tcW w:w="1008" w:type="dxa"/>
             <w:tcBorders>
               <w:top w:val="single" w:sz="8" w:space="0" w:color="A3A3A3"/>
               <w:left w:val="single" w:sz="8" w:space="0" w:color="A3A3A3"/>
@@ -627,7 +627,7 @@
         </w:tc>
         <w:tc>
           <w:tcPr>
-            <w:tcW w:w="989" w:type="dxa"/>
+            <w:tcW w:w="180" w:type="dxa"/>
             <w:tcBorders>
               <w:top w:val="single" w:sz="8" w:space="0" w:color="A3A3A3"/>
               <w:left w:val="single" w:sz="8" w:space="0" w:color="A3A3A3"/>
@@ -665,7 +665,7 @@
         </w:tc>
         <w:tc>
           <w:tcPr>
-            <w:tcW w:w="1344" w:type="dxa"/>
+            <w:tcW w:w="1619" w:type="dxa"/>
             <w:tcBorders>
               <w:top w:val="single" w:sz="8" w:space="0" w:color="A3A3A3"/>
               <w:left w:val="single" w:sz="8" w:space="0" w:color="A3A3A3"/>
@@ -715,7 +715,7 @@
         </w:tc>
         <w:tc>
           <w:tcPr>
-            <w:tcW w:w="1868" w:type="dxa"/>
+            <w:tcW w:w="1308" w:type="dxa"/>
             <w:tcBorders>
               <w:top w:val="single" w:sz="8" w:space="0" w:color="A3A3A3"/>
               <w:left w:val="single" w:sz="8" w:space="0" w:color="A3A3A3"/>
@@ -751,7 +751,7 @@
         </w:tc>
         <w:tc>
           <w:tcPr>
-            <w:tcW w:w="2284" w:type="dxa"/>
+            <w:tcW w:w="1963" w:type="dxa"/>
             <w:tcBorders>
               <w:top w:val="single" w:sz="8" w:space="0" w:color="A3A3A3"/>
               <w:left w:val="single" w:sz="8" w:space="0" w:color="A3A3A3"/>
@@ -787,7 +787,7 @@
         </w:tc>
         <w:tc>
           <w:tcPr>
-            <w:tcW w:w="3613" w:type="dxa"/>
+            <w:tcW w:w="1744" w:type="dxa"/>
             <w:tcBorders>
               <w:top w:val="single" w:sz="8" w:space="0" w:color="A3A3A3"/>
               <w:left w:val="single" w:sz="8" w:space="0" w:color="A3A3A3"/>
@@ -823,7 +823,7 @@
         </w:tc>
         <w:tc>
           <w:tcPr>
-            <w:tcW w:w="2245" w:type="dxa"/>
+            <w:tcW w:w="1408" w:type="dxa"/>
             <w:tcBorders>
               <w:top w:val="single" w:sz="8" w:space="0" w:color="A3A3A3"/>
               <w:left w:val="single" w:sz="8" w:space="0" w:color="A3A3A3"/>
@@ -861,7 +861,7 @@
       <w:tr>
         <w:tc>
           <w:tcPr>
-            <w:tcW w:w="988" w:type="dxa"/>
+            <w:tcW w:w="1008" w:type="dxa"/>
             <w:tcBorders>
               <w:top w:val="single" w:sz="8" w:space="0" w:color="A3A3A3"/>
               <w:left w:val="single" w:sz="8" w:space="0" w:color="A3A3A3"/>
@@ -899,7 +899,7 @@
         </w:tc>
         <w:tc>
           <w:tcPr>
-            <w:tcW w:w="989" w:type="dxa"/>
+            <w:tcW w:w="180" w:type="dxa"/>
             <w:tcBorders>
               <w:top w:val="single" w:sz="8" w:space="0" w:color="A3A3A3"/>
               <w:left w:val="single" w:sz="8" w:space="0" w:color="A3A3A3"/>
@@ -937,7 +937,7 @@
         </w:tc>
         <w:tc>
           <w:tcPr>
-            <w:tcW w:w="1371" w:type="dxa"/>
+            <w:tcW w:w="1619" w:type="dxa"/>
             <w:tcBorders>
               <w:top w:val="single" w:sz="8" w:space="0" w:color="A3A3A3"/>
               <w:left w:val="single" w:sz="8" w:space="0" w:color="A3A3A3"/>
@@ -975,7 +975,7 @@
         </w:tc>
         <w:tc>
           <w:tcPr>
-            <w:tcW w:w="1868" w:type="dxa"/>
+            <w:tcW w:w="1308" w:type="dxa"/>
             <w:tcBorders>
               <w:top w:val="single" w:sz="8" w:space="0" w:color="A3A3A3"/>
               <w:left w:val="single" w:sz="8" w:space="0" w:color="A3A3A3"/>
@@ -1029,7 +1029,7 @@
         </w:tc>
         <w:tc>
           <w:tcPr>
-            <w:tcW w:w="2255" w:type="dxa"/>
+            <w:tcW w:w="1963" w:type="dxa"/>
             <w:tcBorders>
               <w:top w:val="single" w:sz="8" w:space="0" w:color="A3A3A3"/>
               <w:left w:val="single" w:sz="8" w:space="0" w:color="A3A3A3"/>
@@ -1119,7 +1119,7 @@
         </w:tc>
         <w:tc>
           <w:tcPr>
-            <w:tcW w:w="3613" w:type="dxa"/>
+            <w:tcW w:w="1744" w:type="dxa"/>
             <w:tcBorders>
               <w:top w:val="single" w:sz="8" w:space="0" w:color="A3A3A3"/>
               <w:left w:val="single" w:sz="8" w:space="0" w:color="A3A3A3"/>
@@ -1167,13 +1167,31 @@
                 <w:sz w:val="22"/>
                 <w:szCs w:val="22"/>
               </w:rPr>
-              <w:t xml:space="preserve"> aus der konfig ziehen können, ohne das die konfig manuelle manipuliert werden musste.</w:t>
-            </w:r>
-          </w:p>
-        </w:tc>
-        <w:tc>
-          <w:tcPr>
-            <w:tcW w:w="2533" w:type="dxa"/>
+              <w:t xml:space="preserve"> aus der konfig ziehen können, ohne </w:t>
+            </w:r>
+            <w:proofErr w:type="gramStart"/>
+            <w:r>
+              <w:rPr>
+                <w:rFonts w:ascii="Calibri" w:hAnsi="Calibri" w:cs="Calibri"/>
+                <w:sz w:val="22"/>
+                <w:szCs w:val="22"/>
+              </w:rPr>
+              <w:t>das</w:t>
+            </w:r>
+            <w:proofErr w:type="gramEnd"/>
+            <w:r>
+              <w:rPr>
+                <w:rFonts w:ascii="Calibri" w:hAnsi="Calibri" w:cs="Calibri"/>
+                <w:sz w:val="22"/>
+                <w:szCs w:val="22"/>
+              </w:rPr>
+              <w:t xml:space="preserve"> die konfig manuelle manipuliert werden musste.</w:t>
+            </w:r>
+          </w:p>
+        </w:tc>
+        <w:tc>
+          <w:tcPr>
+            <w:tcW w:w="1408" w:type="dxa"/>
             <w:tcBorders>
               <w:top w:val="single" w:sz="8" w:space="0" w:color="A3A3A3"/>
               <w:left w:val="single" w:sz="8" w:space="0" w:color="A3A3A3"/>
@@ -1229,7 +1247,7 @@
       <w:tr>
         <w:tc>
           <w:tcPr>
-            <w:tcW w:w="960" w:type="dxa"/>
+            <w:tcW w:w="1008" w:type="dxa"/>
             <w:tcBorders>
               <w:top w:val="single" w:sz="8" w:space="0" w:color="A3A3A3"/>
               <w:left w:val="single" w:sz="8" w:space="0" w:color="A3A3A3"/>
@@ -1265,7 +1283,7 @@
         </w:tc>
         <w:tc>
           <w:tcPr>
-            <w:tcW w:w="989" w:type="dxa"/>
+            <w:tcW w:w="180" w:type="dxa"/>
             <w:tcBorders>
               <w:top w:val="single" w:sz="8" w:space="0" w:color="A3A3A3"/>
               <w:left w:val="single" w:sz="8" w:space="0" w:color="A3A3A3"/>
@@ -1301,7 +1319,7 @@
         </w:tc>
         <w:tc>
           <w:tcPr>
-            <w:tcW w:w="1344" w:type="dxa"/>
+            <w:tcW w:w="1619" w:type="dxa"/>
             <w:tcBorders>
               <w:top w:val="single" w:sz="8" w:space="0" w:color="A3A3A3"/>
               <w:left w:val="single" w:sz="8" w:space="0" w:color="A3A3A3"/>
@@ -1339,7 +1357,7 @@
         </w:tc>
         <w:tc>
           <w:tcPr>
-            <w:tcW w:w="1868" w:type="dxa"/>
+            <w:tcW w:w="1308" w:type="dxa"/>
             <w:tcBorders>
               <w:top w:val="single" w:sz="8" w:space="0" w:color="A3A3A3"/>
               <w:left w:val="single" w:sz="8" w:space="0" w:color="A3A3A3"/>
@@ -1375,7 +1393,7 @@
         </w:tc>
         <w:tc>
           <w:tcPr>
-            <w:tcW w:w="2255" w:type="dxa"/>
+            <w:tcW w:w="1963" w:type="dxa"/>
             <w:tcBorders>
               <w:top w:val="single" w:sz="8" w:space="0" w:color="A3A3A3"/>
               <w:left w:val="single" w:sz="8" w:space="0" w:color="A3A3A3"/>
@@ -1426,6 +1444,7 @@
               <w:t xml:space="preserve"> </w:t>
             </w:r>
             <w:proofErr w:type="spellStart"/>
+            <w:proofErr w:type="gramStart"/>
             <w:r>
               <w:rPr>
                 <w:rFonts w:ascii="Calibri" w:hAnsi="Calibri" w:cs="Calibri"/>
@@ -1435,6 +1454,7 @@
               <w:t>ließt</w:t>
             </w:r>
             <w:proofErr w:type="spellEnd"/>
+            <w:proofErr w:type="gramEnd"/>
             <w:r>
               <w:rPr>
                 <w:rFonts w:ascii="Calibri" w:hAnsi="Calibri" w:cs="Calibri"/>
@@ -1447,7 +1467,7 @@
         </w:tc>
         <w:tc>
           <w:tcPr>
-            <w:tcW w:w="3613" w:type="dxa"/>
+            <w:tcW w:w="1744" w:type="dxa"/>
             <w:tcBorders>
               <w:top w:val="single" w:sz="8" w:space="0" w:color="A3A3A3"/>
               <w:left w:val="single" w:sz="8" w:space="0" w:color="A3A3A3"/>
@@ -1519,37 +1539,55 @@
         </w:tc>
         <w:tc>
           <w:tcPr>
-            <w:tcW w:w="2533" w:type="dxa"/>
-            <w:tcBorders>
-              <w:top w:val="single" w:sz="8" w:space="0" w:color="A3A3A3"/>
-              <w:left w:val="single" w:sz="8" w:space="0" w:color="A3A3A3"/>
-              <w:bottom w:val="single" w:sz="8" w:space="0" w:color="A3A3A3"/>
-              <w:right w:val="single" w:sz="8" w:space="0" w:color="A3A3A3"/>
-            </w:tcBorders>
-            <w:tcMar>
-              <w:top w:w="80" w:type="dxa"/>
-              <w:left w:w="80" w:type="dxa"/>
-              <w:bottom w:w="80" w:type="dxa"/>
-              <w:right w:w="80" w:type="dxa"/>
-            </w:tcMar>
-            <w:hideMark/>
-          </w:tcPr>
-          <w:p>
-            <w:pPr>
-              <w:spacing w:after="0"/>
-              <w:rPr>
-                <w:rFonts w:ascii="Calibri" w:hAnsi="Calibri" w:cs="Calibri"/>
-                <w:sz w:val="22"/>
-                <w:szCs w:val="22"/>
-              </w:rPr>
-            </w:pPr>
-            <w:r>
-              <w:rPr>
-                <w:rFonts w:ascii="Calibri" w:hAnsi="Calibri" w:cs="Calibri"/>
-                <w:sz w:val="22"/>
-                <w:szCs w:val="22"/>
-              </w:rPr>
-              <w:t xml:space="preserve">Es wurden Manuell semantisch + grammatikalisch Falsche </w:t>
+            <w:tcW w:w="1408" w:type="dxa"/>
+            <w:tcBorders>
+              <w:top w:val="single" w:sz="8" w:space="0" w:color="A3A3A3"/>
+              <w:left w:val="single" w:sz="8" w:space="0" w:color="A3A3A3"/>
+              <w:bottom w:val="single" w:sz="8" w:space="0" w:color="A3A3A3"/>
+              <w:right w:val="single" w:sz="8" w:space="0" w:color="A3A3A3"/>
+            </w:tcBorders>
+            <w:tcMar>
+              <w:top w:w="80" w:type="dxa"/>
+              <w:left w:w="80" w:type="dxa"/>
+              <w:bottom w:w="80" w:type="dxa"/>
+              <w:right w:w="80" w:type="dxa"/>
+            </w:tcMar>
+            <w:hideMark/>
+          </w:tcPr>
+          <w:p>
+            <w:pPr>
+              <w:spacing w:after="0"/>
+              <w:rPr>
+                <w:rFonts w:ascii="Calibri" w:hAnsi="Calibri" w:cs="Calibri"/>
+                <w:sz w:val="22"/>
+                <w:szCs w:val="22"/>
+              </w:rPr>
+            </w:pPr>
+            <w:r>
+              <w:rPr>
+                <w:rFonts w:ascii="Calibri" w:hAnsi="Calibri" w:cs="Calibri"/>
+                <w:sz w:val="22"/>
+                <w:szCs w:val="22"/>
+              </w:rPr>
+              <w:t xml:space="preserve">Es wurden </w:t>
+            </w:r>
+            <w:proofErr w:type="gramStart"/>
+            <w:r>
+              <w:rPr>
+                <w:rFonts w:ascii="Calibri" w:hAnsi="Calibri" w:cs="Calibri"/>
+                <w:sz w:val="22"/>
+                <w:szCs w:val="22"/>
+              </w:rPr>
+              <w:t>Manuell</w:t>
+            </w:r>
+            <w:proofErr w:type="gramEnd"/>
+            <w:r>
+              <w:rPr>
+                <w:rFonts w:ascii="Calibri" w:hAnsi="Calibri" w:cs="Calibri"/>
+                <w:sz w:val="22"/>
+                <w:szCs w:val="22"/>
+              </w:rPr>
+              <w:t xml:space="preserve"> semantisch + grammatikalisch Falsche </w:t>
             </w:r>
             <w:proofErr w:type="spellStart"/>
             <w:r>
@@ -1575,7 +1613,7 @@
       <w:tr>
         <w:tc>
           <w:tcPr>
-            <w:tcW w:w="988" w:type="dxa"/>
+            <w:tcW w:w="1008" w:type="dxa"/>
             <w:tcBorders>
               <w:top w:val="single" w:sz="8" w:space="0" w:color="A3A3A3"/>
               <w:left w:val="single" w:sz="8" w:space="0" w:color="A3A3A3"/>
@@ -1613,7 +1651,7 @@
         </w:tc>
         <w:tc>
           <w:tcPr>
-            <w:tcW w:w="989" w:type="dxa"/>
+            <w:tcW w:w="180" w:type="dxa"/>
             <w:tcBorders>
               <w:top w:val="single" w:sz="8" w:space="0" w:color="A3A3A3"/>
               <w:left w:val="single" w:sz="8" w:space="0" w:color="A3A3A3"/>
@@ -1651,7 +1689,7 @@
         </w:tc>
         <w:tc>
           <w:tcPr>
-            <w:tcW w:w="1344" w:type="dxa"/>
+            <w:tcW w:w="1619" w:type="dxa"/>
             <w:tcBorders>
               <w:top w:val="single" w:sz="8" w:space="0" w:color="A3A3A3"/>
               <w:left w:val="single" w:sz="8" w:space="0" w:color="A3A3A3"/>
@@ -1689,7 +1727,7 @@
         </w:tc>
         <w:tc>
           <w:tcPr>
-            <w:tcW w:w="1868" w:type="dxa"/>
+            <w:tcW w:w="1308" w:type="dxa"/>
             <w:tcBorders>
               <w:top w:val="single" w:sz="8" w:space="0" w:color="A3A3A3"/>
               <w:left w:val="single" w:sz="8" w:space="0" w:color="A3A3A3"/>
@@ -1725,7 +1763,7 @@
         </w:tc>
         <w:tc>
           <w:tcPr>
-            <w:tcW w:w="2255" w:type="dxa"/>
+            <w:tcW w:w="1963" w:type="dxa"/>
             <w:tcBorders>
               <w:top w:val="single" w:sz="8" w:space="0" w:color="A3A3A3"/>
               <w:left w:val="single" w:sz="8" w:space="0" w:color="A3A3A3"/>
@@ -1761,7 +1799,7 @@
         </w:tc>
         <w:tc>
           <w:tcPr>
-            <w:tcW w:w="3613" w:type="dxa"/>
+            <w:tcW w:w="1744" w:type="dxa"/>
             <w:tcBorders>
               <w:top w:val="single" w:sz="8" w:space="0" w:color="A3A3A3"/>
               <w:left w:val="single" w:sz="8" w:space="0" w:color="A3A3A3"/>
@@ -1797,7 +1835,7 @@
         </w:tc>
         <w:tc>
           <w:tcPr>
-            <w:tcW w:w="2677" w:type="dxa"/>
+            <w:tcW w:w="1408" w:type="dxa"/>
             <w:tcBorders>
               <w:top w:val="single" w:sz="8" w:space="0" w:color="A3A3A3"/>
               <w:left w:val="single" w:sz="8" w:space="0" w:color="A3A3A3"/>
@@ -1835,95 +1873,83 @@
       <w:tr>
         <w:tc>
           <w:tcPr>
-            <w:tcW w:w="988" w:type="dxa"/>
-            <w:tcBorders>
-              <w:top w:val="single" w:sz="8" w:space="0" w:color="A3A3A3"/>
-              <w:left w:val="single" w:sz="8" w:space="0" w:color="A3A3A3"/>
-              <w:bottom w:val="single" w:sz="8" w:space="0" w:color="A3A3A3"/>
-              <w:right w:val="single" w:sz="8" w:space="0" w:color="A3A3A3"/>
-            </w:tcBorders>
-            <w:tcMar>
-              <w:top w:w="80" w:type="dxa"/>
-              <w:left w:w="80" w:type="dxa"/>
-              <w:bottom w:w="80" w:type="dxa"/>
-              <w:right w:w="80" w:type="dxa"/>
-            </w:tcMar>
-            <w:hideMark/>
-          </w:tcPr>
-          <w:p>
-            <w:pPr>
-              <w:spacing w:after="0"/>
-              <w:rPr>
-                <w:rFonts w:ascii="Calibri" w:hAnsi="Calibri" w:cs="Calibri"/>
-                <w:sz w:val="22"/>
-                <w:szCs w:val="22"/>
-              </w:rPr>
-            </w:pPr>
-            <w:r>
-              <w:rPr>
-                <w:rFonts w:ascii="Calibri" w:hAnsi="Calibri" w:cs="Calibri"/>
-                <w:b/>
-                <w:bCs/>
-                <w:sz w:val="22"/>
-                <w:szCs w:val="22"/>
-              </w:rPr>
-              <w:t>T-W</w:t>
-            </w:r>
-            <w:r>
-              <w:rPr>
-                <w:rFonts w:ascii="Calibri" w:hAnsi="Calibri" w:cs="Calibri"/>
-                <w:b/>
-                <w:bCs/>
-                <w:sz w:val="22"/>
-                <w:szCs w:val="22"/>
-              </w:rPr>
-              <w:lastRenderedPageBreak/>
-              <w:t>-05</w:t>
-            </w:r>
-          </w:p>
-        </w:tc>
-        <w:tc>
-          <w:tcPr>
-            <w:tcW w:w="989" w:type="dxa"/>
-            <w:tcBorders>
-              <w:top w:val="single" w:sz="8" w:space="0" w:color="A3A3A3"/>
-              <w:left w:val="single" w:sz="8" w:space="0" w:color="A3A3A3"/>
-              <w:bottom w:val="single" w:sz="8" w:space="0" w:color="A3A3A3"/>
-              <w:right w:val="single" w:sz="8" w:space="0" w:color="A3A3A3"/>
-            </w:tcBorders>
-            <w:tcMar>
-              <w:top w:w="80" w:type="dxa"/>
-              <w:left w:w="80" w:type="dxa"/>
-              <w:bottom w:w="80" w:type="dxa"/>
-              <w:right w:w="80" w:type="dxa"/>
-            </w:tcMar>
-            <w:hideMark/>
-          </w:tcPr>
-          <w:p>
-            <w:pPr>
-              <w:spacing w:after="0"/>
-              <w:rPr>
-                <w:rFonts w:ascii="Calibri" w:hAnsi="Calibri" w:cs="Calibri"/>
-                <w:sz w:val="22"/>
-                <w:szCs w:val="22"/>
-              </w:rPr>
-            </w:pPr>
-            <w:r>
-              <w:rPr>
-                <w:rFonts w:ascii="Calibri" w:hAnsi="Calibri" w:cs="Calibri"/>
-                <w:b/>
-                <w:bCs/>
-                <w:sz w:val="22"/>
-                <w:szCs w:val="22"/>
-              </w:rPr>
-              <w:lastRenderedPageBreak/>
+            <w:tcW w:w="1008" w:type="dxa"/>
+            <w:tcBorders>
+              <w:top w:val="single" w:sz="8" w:space="0" w:color="A3A3A3"/>
+              <w:left w:val="single" w:sz="8" w:space="0" w:color="A3A3A3"/>
+              <w:bottom w:val="single" w:sz="8" w:space="0" w:color="A3A3A3"/>
+              <w:right w:val="single" w:sz="8" w:space="0" w:color="A3A3A3"/>
+            </w:tcBorders>
+            <w:tcMar>
+              <w:top w:w="80" w:type="dxa"/>
+              <w:left w:w="80" w:type="dxa"/>
+              <w:bottom w:w="80" w:type="dxa"/>
+              <w:right w:w="80" w:type="dxa"/>
+            </w:tcMar>
+            <w:hideMark/>
+          </w:tcPr>
+          <w:p>
+            <w:pPr>
+              <w:spacing w:after="0"/>
+              <w:rPr>
+                <w:rFonts w:ascii="Calibri" w:hAnsi="Calibri" w:cs="Calibri"/>
+                <w:sz w:val="22"/>
+                <w:szCs w:val="22"/>
+              </w:rPr>
+            </w:pPr>
+            <w:r>
+              <w:rPr>
+                <w:rFonts w:ascii="Calibri" w:hAnsi="Calibri" w:cs="Calibri"/>
+                <w:b/>
+                <w:bCs/>
+                <w:sz w:val="22"/>
+                <w:szCs w:val="22"/>
+              </w:rPr>
+              <w:t>T-W-05</w:t>
+            </w:r>
+          </w:p>
+        </w:tc>
+        <w:tc>
+          <w:tcPr>
+            <w:tcW w:w="180" w:type="dxa"/>
+            <w:tcBorders>
+              <w:top w:val="single" w:sz="8" w:space="0" w:color="A3A3A3"/>
+              <w:left w:val="single" w:sz="8" w:space="0" w:color="A3A3A3"/>
+              <w:bottom w:val="single" w:sz="8" w:space="0" w:color="A3A3A3"/>
+              <w:right w:val="single" w:sz="8" w:space="0" w:color="A3A3A3"/>
+            </w:tcBorders>
+            <w:tcMar>
+              <w:top w:w="80" w:type="dxa"/>
+              <w:left w:w="80" w:type="dxa"/>
+              <w:bottom w:w="80" w:type="dxa"/>
+              <w:right w:w="80" w:type="dxa"/>
+            </w:tcMar>
+            <w:hideMark/>
+          </w:tcPr>
+          <w:p>
+            <w:pPr>
+              <w:spacing w:after="0"/>
+              <w:rPr>
+                <w:rFonts w:ascii="Calibri" w:hAnsi="Calibri" w:cs="Calibri"/>
+                <w:sz w:val="22"/>
+                <w:szCs w:val="22"/>
+              </w:rPr>
+            </w:pPr>
+            <w:r>
+              <w:rPr>
+                <w:rFonts w:ascii="Calibri" w:hAnsi="Calibri" w:cs="Calibri"/>
+                <w:b/>
+                <w:bCs/>
+                <w:sz w:val="22"/>
+                <w:szCs w:val="22"/>
+              </w:rPr>
               <w:t>KA-W-05</w:t>
             </w:r>
           </w:p>
         </w:tc>
         <w:tc>
           <w:tcPr>
-            <w:tcW w:w="1371" w:type="dxa"/>
+            <w:tcW w:w="1619" w:type="dxa"/>
             <w:tcBorders>
               <w:top w:val="single" w:sz="8" w:space="0" w:color="A3A3A3"/>
               <w:left w:val="single" w:sz="8" w:space="0" w:color="A3A3A3"/>
@@ -1961,7 +1987,7 @@
         </w:tc>
         <w:tc>
           <w:tcPr>
-            <w:tcW w:w="1868" w:type="dxa"/>
+            <w:tcW w:w="1308" w:type="dxa"/>
             <w:tcBorders>
               <w:top w:val="single" w:sz="8" w:space="0" w:color="A3A3A3"/>
               <w:left w:val="single" w:sz="8" w:space="0" w:color="A3A3A3"/>
@@ -1997,7 +2023,7 @@
         </w:tc>
         <w:tc>
           <w:tcPr>
-            <w:tcW w:w="2255" w:type="dxa"/>
+            <w:tcW w:w="1963" w:type="dxa"/>
             <w:tcBorders>
               <w:top w:val="single" w:sz="8" w:space="0" w:color="A3A3A3"/>
               <w:left w:val="single" w:sz="8" w:space="0" w:color="A3A3A3"/>
@@ -2033,82 +2059,72 @@
         </w:tc>
         <w:tc>
           <w:tcPr>
-            <w:tcW w:w="3613" w:type="dxa"/>
-            <w:tcBorders>
-              <w:top w:val="single" w:sz="8" w:space="0" w:color="A3A3A3"/>
-              <w:left w:val="single" w:sz="8" w:space="0" w:color="A3A3A3"/>
-              <w:bottom w:val="single" w:sz="8" w:space="0" w:color="A3A3A3"/>
-              <w:right w:val="single" w:sz="8" w:space="0" w:color="A3A3A3"/>
-            </w:tcBorders>
-            <w:tcMar>
-              <w:top w:w="80" w:type="dxa"/>
-              <w:left w:w="80" w:type="dxa"/>
-              <w:bottom w:w="80" w:type="dxa"/>
-              <w:right w:w="80" w:type="dxa"/>
-            </w:tcMar>
-            <w:hideMark/>
-          </w:tcPr>
-          <w:p>
-            <w:pPr>
-              <w:spacing w:after="0"/>
-              <w:rPr>
-                <w:rFonts w:ascii="Calibri" w:hAnsi="Calibri" w:cs="Calibri"/>
-                <w:sz w:val="22"/>
-                <w:szCs w:val="22"/>
-              </w:rPr>
-            </w:pPr>
-            <w:r>
-              <w:rPr>
-                <w:rFonts w:ascii="Calibri" w:hAnsi="Calibri" w:cs="Calibri"/>
-                <w:sz w:val="22"/>
-                <w:szCs w:val="22"/>
-              </w:rPr>
-              <w:t xml:space="preserve">Es erfolgen 4 Status-Prüfungen </w:t>
-            </w:r>
-            <w:r>
-              <w:rPr>
-                <w:rFonts w:ascii="Calibri" w:hAnsi="Calibri" w:cs="Calibri"/>
-                <w:sz w:val="22"/>
-                <w:szCs w:val="22"/>
-              </w:rPr>
-              <w:lastRenderedPageBreak/>
-              <w:t>im korrekten Zeitabstand.</w:t>
-            </w:r>
-          </w:p>
-        </w:tc>
-        <w:tc>
-          <w:tcPr>
-            <w:tcW w:w="2664" w:type="dxa"/>
-            <w:tcBorders>
-              <w:top w:val="single" w:sz="8" w:space="0" w:color="A3A3A3"/>
-              <w:left w:val="single" w:sz="8" w:space="0" w:color="A3A3A3"/>
-              <w:bottom w:val="single" w:sz="8" w:space="0" w:color="A3A3A3"/>
-              <w:right w:val="single" w:sz="8" w:space="0" w:color="A3A3A3"/>
-            </w:tcBorders>
-            <w:tcMar>
-              <w:top w:w="80" w:type="dxa"/>
-              <w:left w:w="80" w:type="dxa"/>
-              <w:bottom w:w="80" w:type="dxa"/>
-              <w:right w:w="80" w:type="dxa"/>
-            </w:tcMar>
-            <w:hideMark/>
-          </w:tcPr>
-          <w:p>
-            <w:pPr>
-              <w:spacing w:after="0"/>
-              <w:rPr>
-                <w:rFonts w:ascii="Calibri" w:hAnsi="Calibri" w:cs="Calibri"/>
-                <w:sz w:val="22"/>
-                <w:szCs w:val="22"/>
-              </w:rPr>
-            </w:pPr>
-            <w:r>
-              <w:rPr>
-                <w:rFonts w:ascii="Calibri" w:hAnsi="Calibri" w:cs="Calibri"/>
-                <w:sz w:val="22"/>
-                <w:szCs w:val="22"/>
-              </w:rPr>
-              <w:lastRenderedPageBreak/>
+            <w:tcW w:w="1744" w:type="dxa"/>
+            <w:tcBorders>
+              <w:top w:val="single" w:sz="8" w:space="0" w:color="A3A3A3"/>
+              <w:left w:val="single" w:sz="8" w:space="0" w:color="A3A3A3"/>
+              <w:bottom w:val="single" w:sz="8" w:space="0" w:color="A3A3A3"/>
+              <w:right w:val="single" w:sz="8" w:space="0" w:color="A3A3A3"/>
+            </w:tcBorders>
+            <w:tcMar>
+              <w:top w:w="80" w:type="dxa"/>
+              <w:left w:w="80" w:type="dxa"/>
+              <w:bottom w:w="80" w:type="dxa"/>
+              <w:right w:w="80" w:type="dxa"/>
+            </w:tcMar>
+            <w:hideMark/>
+          </w:tcPr>
+          <w:p>
+            <w:pPr>
+              <w:spacing w:after="0"/>
+              <w:rPr>
+                <w:rFonts w:ascii="Calibri" w:hAnsi="Calibri" w:cs="Calibri"/>
+                <w:sz w:val="22"/>
+                <w:szCs w:val="22"/>
+              </w:rPr>
+            </w:pPr>
+            <w:r>
+              <w:rPr>
+                <w:rFonts w:ascii="Calibri" w:hAnsi="Calibri" w:cs="Calibri"/>
+                <w:sz w:val="22"/>
+                <w:szCs w:val="22"/>
+              </w:rPr>
+              <w:t>Es erfolgen 4 Status-Prüfungen im korrekten Zeitabstand.</w:t>
+            </w:r>
+          </w:p>
+        </w:tc>
+        <w:tc>
+          <w:tcPr>
+            <w:tcW w:w="1408" w:type="dxa"/>
+            <w:tcBorders>
+              <w:top w:val="single" w:sz="8" w:space="0" w:color="A3A3A3"/>
+              <w:left w:val="single" w:sz="8" w:space="0" w:color="A3A3A3"/>
+              <w:bottom w:val="single" w:sz="8" w:space="0" w:color="A3A3A3"/>
+              <w:right w:val="single" w:sz="8" w:space="0" w:color="A3A3A3"/>
+            </w:tcBorders>
+            <w:tcMar>
+              <w:top w:w="80" w:type="dxa"/>
+              <w:left w:w="80" w:type="dxa"/>
+              <w:bottom w:w="80" w:type="dxa"/>
+              <w:right w:w="80" w:type="dxa"/>
+            </w:tcMar>
+            <w:hideMark/>
+          </w:tcPr>
+          <w:p>
+            <w:pPr>
+              <w:spacing w:after="0"/>
+              <w:rPr>
+                <w:rFonts w:ascii="Calibri" w:hAnsi="Calibri" w:cs="Calibri"/>
+                <w:sz w:val="22"/>
+                <w:szCs w:val="22"/>
+              </w:rPr>
+            </w:pPr>
+            <w:r>
+              <w:rPr>
+                <w:rFonts w:ascii="Calibri" w:hAnsi="Calibri" w:cs="Calibri"/>
+                <w:sz w:val="22"/>
+                <w:szCs w:val="22"/>
+              </w:rPr>
               <w:t>Intervall ist auf 0s oder &lt; 1s gesetzt.</w:t>
             </w:r>
           </w:p>
@@ -2117,7 +2133,7 @@
       <w:tr>
         <w:tc>
           <w:tcPr>
-            <w:tcW w:w="988" w:type="dxa"/>
+            <w:tcW w:w="1008" w:type="dxa"/>
             <w:tcBorders>
               <w:top w:val="single" w:sz="8" w:space="0" w:color="A3A3A3"/>
               <w:left w:val="single" w:sz="8" w:space="0" w:color="A3A3A3"/>
@@ -2155,7 +2171,7 @@
         </w:tc>
         <w:tc>
           <w:tcPr>
-            <w:tcW w:w="989" w:type="dxa"/>
+            <w:tcW w:w="180" w:type="dxa"/>
             <w:tcBorders>
               <w:top w:val="single" w:sz="8" w:space="0" w:color="A3A3A3"/>
               <w:left w:val="single" w:sz="8" w:space="0" w:color="A3A3A3"/>
@@ -2193,7 +2209,7 @@
         </w:tc>
         <w:tc>
           <w:tcPr>
-            <w:tcW w:w="1364" w:type="dxa"/>
+            <w:tcW w:w="1619" w:type="dxa"/>
             <w:tcBorders>
               <w:top w:val="single" w:sz="8" w:space="0" w:color="A3A3A3"/>
               <w:left w:val="single" w:sz="8" w:space="0" w:color="A3A3A3"/>
@@ -2243,7 +2259,7 @@
         </w:tc>
         <w:tc>
           <w:tcPr>
-            <w:tcW w:w="1895" w:type="dxa"/>
+            <w:tcW w:w="1308" w:type="dxa"/>
             <w:tcBorders>
               <w:top w:val="single" w:sz="8" w:space="0" w:color="A3A3A3"/>
               <w:left w:val="single" w:sz="8" w:space="0" w:color="A3A3A3"/>
@@ -2297,7 +2313,7 @@
         </w:tc>
         <w:tc>
           <w:tcPr>
-            <w:tcW w:w="2255" w:type="dxa"/>
+            <w:tcW w:w="1963" w:type="dxa"/>
             <w:tcBorders>
               <w:top w:val="single" w:sz="8" w:space="0" w:color="A3A3A3"/>
               <w:left w:val="single" w:sz="8" w:space="0" w:color="A3A3A3"/>
@@ -2333,7 +2349,7 @@
         </w:tc>
         <w:tc>
           <w:tcPr>
-            <w:tcW w:w="3632" w:type="dxa"/>
+            <w:tcW w:w="1744" w:type="dxa"/>
             <w:tcBorders>
               <w:top w:val="single" w:sz="8" w:space="0" w:color="A3A3A3"/>
               <w:left w:val="single" w:sz="8" w:space="0" w:color="A3A3A3"/>
@@ -2387,7 +2403,7 @@
         </w:tc>
         <w:tc>
           <w:tcPr>
-            <w:tcW w:w="2602" w:type="dxa"/>
+            <w:tcW w:w="1408" w:type="dxa"/>
             <w:tcBorders>
               <w:top w:val="single" w:sz="8" w:space="0" w:color="A3A3A3"/>
               <w:left w:val="single" w:sz="8" w:space="0" w:color="A3A3A3"/>
@@ -2443,45 +2459,46 @@
       <w:tr>
         <w:tc>
           <w:tcPr>
-            <w:tcW w:w="988" w:type="dxa"/>
-            <w:tcBorders>
-              <w:top w:val="single" w:sz="8" w:space="0" w:color="A3A3A3"/>
-              <w:left w:val="single" w:sz="8" w:space="0" w:color="A3A3A3"/>
-              <w:bottom w:val="single" w:sz="8" w:space="0" w:color="A3A3A3"/>
-              <w:right w:val="single" w:sz="8" w:space="0" w:color="A3A3A3"/>
-            </w:tcBorders>
-            <w:tcMar>
-              <w:top w:w="80" w:type="dxa"/>
-              <w:left w:w="80" w:type="dxa"/>
-              <w:bottom w:w="80" w:type="dxa"/>
-              <w:right w:w="80" w:type="dxa"/>
-            </w:tcMar>
-            <w:hideMark/>
-          </w:tcPr>
-          <w:p>
-            <w:pPr>
-              <w:spacing w:after="0"/>
-              <w:rPr>
-                <w:rFonts w:ascii="Calibri" w:hAnsi="Calibri" w:cs="Calibri"/>
-                <w:sz w:val="22"/>
-                <w:szCs w:val="22"/>
-              </w:rPr>
-            </w:pPr>
-            <w:r>
-              <w:rPr>
-                <w:rFonts w:ascii="Calibri" w:hAnsi="Calibri" w:cs="Calibri"/>
-                <w:b/>
-                <w:bCs/>
-                <w:sz w:val="22"/>
-                <w:szCs w:val="22"/>
-              </w:rPr>
+            <w:tcW w:w="1008" w:type="dxa"/>
+            <w:tcBorders>
+              <w:top w:val="single" w:sz="8" w:space="0" w:color="A3A3A3"/>
+              <w:left w:val="single" w:sz="8" w:space="0" w:color="A3A3A3"/>
+              <w:bottom w:val="single" w:sz="8" w:space="0" w:color="A3A3A3"/>
+              <w:right w:val="single" w:sz="8" w:space="0" w:color="A3A3A3"/>
+            </w:tcBorders>
+            <w:tcMar>
+              <w:top w:w="80" w:type="dxa"/>
+              <w:left w:w="80" w:type="dxa"/>
+              <w:bottom w:w="80" w:type="dxa"/>
+              <w:right w:w="80" w:type="dxa"/>
+            </w:tcMar>
+            <w:hideMark/>
+          </w:tcPr>
+          <w:p>
+            <w:pPr>
+              <w:spacing w:after="0"/>
+              <w:rPr>
+                <w:rFonts w:ascii="Calibri" w:hAnsi="Calibri" w:cs="Calibri"/>
+                <w:sz w:val="22"/>
+                <w:szCs w:val="22"/>
+              </w:rPr>
+            </w:pPr>
+            <w:r>
+              <w:rPr>
+                <w:rFonts w:ascii="Calibri" w:hAnsi="Calibri" w:cs="Calibri"/>
+                <w:b/>
+                <w:bCs/>
+                <w:sz w:val="22"/>
+                <w:szCs w:val="22"/>
+              </w:rPr>
+              <w:lastRenderedPageBreak/>
               <w:t>T-W-07</w:t>
             </w:r>
           </w:p>
         </w:tc>
         <w:tc>
           <w:tcPr>
-            <w:tcW w:w="989" w:type="dxa"/>
+            <w:tcW w:w="180" w:type="dxa"/>
             <w:tcBorders>
               <w:top w:val="single" w:sz="8" w:space="0" w:color="A3A3A3"/>
               <w:left w:val="single" w:sz="8" w:space="0" w:color="A3A3A3"/>
@@ -2519,7 +2536,7 @@
         </w:tc>
         <w:tc>
           <w:tcPr>
-            <w:tcW w:w="1344" w:type="dxa"/>
+            <w:tcW w:w="1619" w:type="dxa"/>
             <w:tcBorders>
               <w:top w:val="single" w:sz="8" w:space="0" w:color="A3A3A3"/>
               <w:left w:val="single" w:sz="8" w:space="0" w:color="A3A3A3"/>
@@ -2557,7 +2574,7 @@
         </w:tc>
         <w:tc>
           <w:tcPr>
-            <w:tcW w:w="1868" w:type="dxa"/>
+            <w:tcW w:w="1308" w:type="dxa"/>
             <w:tcBorders>
               <w:top w:val="single" w:sz="8" w:space="0" w:color="A3A3A3"/>
               <w:left w:val="single" w:sz="8" w:space="0" w:color="A3A3A3"/>
@@ -2593,7 +2610,7 @@
         </w:tc>
         <w:tc>
           <w:tcPr>
-            <w:tcW w:w="2255" w:type="dxa"/>
+            <w:tcW w:w="1963" w:type="dxa"/>
             <w:tcBorders>
               <w:top w:val="single" w:sz="8" w:space="0" w:color="A3A3A3"/>
               <w:left w:val="single" w:sz="8" w:space="0" w:color="A3A3A3"/>
@@ -2629,7 +2646,7 @@
         </w:tc>
         <w:tc>
           <w:tcPr>
-            <w:tcW w:w="3640" w:type="dxa"/>
+            <w:tcW w:w="1744" w:type="dxa"/>
             <w:tcBorders>
               <w:top w:val="single" w:sz="8" w:space="0" w:color="A3A3A3"/>
               <w:left w:val="single" w:sz="8" w:space="0" w:color="A3A3A3"/>
@@ -2665,7 +2682,7 @@
         </w:tc>
         <w:tc>
           <w:tcPr>
-            <w:tcW w:w="2683" w:type="dxa"/>
+            <w:tcW w:w="1408" w:type="dxa"/>
             <w:tcBorders>
               <w:top w:val="single" w:sz="8" w:space="0" w:color="A3A3A3"/>
               <w:left w:val="single" w:sz="8" w:space="0" w:color="A3A3A3"/>
@@ -2703,7 +2720,7 @@
       <w:tr>
         <w:tc>
           <w:tcPr>
-            <w:tcW w:w="988" w:type="dxa"/>
+            <w:tcW w:w="1008" w:type="dxa"/>
             <w:tcBorders>
               <w:top w:val="single" w:sz="8" w:space="0" w:color="A3A3A3"/>
               <w:left w:val="single" w:sz="8" w:space="0" w:color="A3A3A3"/>
@@ -2741,7 +2758,7 @@
         </w:tc>
         <w:tc>
           <w:tcPr>
-            <w:tcW w:w="989" w:type="dxa"/>
+            <w:tcW w:w="180" w:type="dxa"/>
             <w:tcBorders>
               <w:top w:val="single" w:sz="8" w:space="0" w:color="A3A3A3"/>
               <w:left w:val="single" w:sz="8" w:space="0" w:color="A3A3A3"/>
@@ -2779,7 +2796,7 @@
         </w:tc>
         <w:tc>
           <w:tcPr>
-            <w:tcW w:w="1371" w:type="dxa"/>
+            <w:tcW w:w="1619" w:type="dxa"/>
             <w:tcBorders>
               <w:top w:val="single" w:sz="8" w:space="0" w:color="A3A3A3"/>
               <w:left w:val="single" w:sz="8" w:space="0" w:color="A3A3A3"/>
@@ -2817,7 +2834,7 @@
         </w:tc>
         <w:tc>
           <w:tcPr>
-            <w:tcW w:w="1868" w:type="dxa"/>
+            <w:tcW w:w="1308" w:type="dxa"/>
             <w:tcBorders>
               <w:top w:val="single" w:sz="8" w:space="0" w:color="A3A3A3"/>
               <w:left w:val="single" w:sz="8" w:space="0" w:color="A3A3A3"/>
@@ -2853,7 +2870,7 @@
         </w:tc>
         <w:tc>
           <w:tcPr>
-            <w:tcW w:w="2255" w:type="dxa"/>
+            <w:tcW w:w="1963" w:type="dxa"/>
             <w:tcBorders>
               <w:top w:val="single" w:sz="8" w:space="0" w:color="A3A3A3"/>
               <w:left w:val="single" w:sz="8" w:space="0" w:color="A3A3A3"/>
@@ -2889,7 +2906,7 @@
         </w:tc>
         <w:tc>
           <w:tcPr>
-            <w:tcW w:w="3639" w:type="dxa"/>
+            <w:tcW w:w="1744" w:type="dxa"/>
             <w:tcBorders>
               <w:top w:val="single" w:sz="8" w:space="0" w:color="A3A3A3"/>
               <w:left w:val="single" w:sz="8" w:space="0" w:color="A3A3A3"/>
@@ -2925,7 +2942,7 @@
         </w:tc>
         <w:tc>
           <w:tcPr>
-            <w:tcW w:w="2533" w:type="dxa"/>
+            <w:tcW w:w="1408" w:type="dxa"/>
             <w:tcBorders>
               <w:top w:val="single" w:sz="8" w:space="0" w:color="A3A3A3"/>
               <w:left w:val="single" w:sz="8" w:space="0" w:color="A3A3A3"/>
@@ -2963,7 +2980,7 @@
       <w:tr>
         <w:tc>
           <w:tcPr>
-            <w:tcW w:w="988" w:type="dxa"/>
+            <w:tcW w:w="1008" w:type="dxa"/>
             <w:tcBorders>
               <w:top w:val="single" w:sz="8" w:space="0" w:color="A3A3A3"/>
               <w:left w:val="single" w:sz="8" w:space="0" w:color="A3A3A3"/>
@@ -3001,7 +3018,7 @@
         </w:tc>
         <w:tc>
           <w:tcPr>
-            <w:tcW w:w="989" w:type="dxa"/>
+            <w:tcW w:w="180" w:type="dxa"/>
             <w:tcBorders>
               <w:top w:val="single" w:sz="8" w:space="0" w:color="A3A3A3"/>
               <w:left w:val="single" w:sz="8" w:space="0" w:color="A3A3A3"/>
@@ -3039,7 +3056,7 @@
         </w:tc>
         <w:tc>
           <w:tcPr>
-            <w:tcW w:w="1371" w:type="dxa"/>
+            <w:tcW w:w="1619" w:type="dxa"/>
             <w:tcBorders>
               <w:top w:val="single" w:sz="8" w:space="0" w:color="A3A3A3"/>
               <w:left w:val="single" w:sz="8" w:space="0" w:color="A3A3A3"/>
@@ -3077,7 +3094,7 @@
         </w:tc>
         <w:tc>
           <w:tcPr>
-            <w:tcW w:w="1868" w:type="dxa"/>
+            <w:tcW w:w="1308" w:type="dxa"/>
             <w:tcBorders>
               <w:top w:val="single" w:sz="8" w:space="0" w:color="A3A3A3"/>
               <w:left w:val="single" w:sz="8" w:space="0" w:color="A3A3A3"/>
@@ -3113,7 +3130,7 @@
         </w:tc>
         <w:tc>
           <w:tcPr>
-            <w:tcW w:w="2281" w:type="dxa"/>
+            <w:tcW w:w="1963" w:type="dxa"/>
             <w:tcBorders>
               <w:top w:val="single" w:sz="8" w:space="0" w:color="A3A3A3"/>
               <w:left w:val="single" w:sz="8" w:space="0" w:color="A3A3A3"/>
@@ -3149,7 +3166,7 @@
         </w:tc>
         <w:tc>
           <w:tcPr>
-            <w:tcW w:w="3613" w:type="dxa"/>
+            <w:tcW w:w="1744" w:type="dxa"/>
             <w:tcBorders>
               <w:top w:val="single" w:sz="8" w:space="0" w:color="A3A3A3"/>
               <w:left w:val="single" w:sz="8" w:space="0" w:color="A3A3A3"/>
@@ -3203,7 +3220,7 @@
         </w:tc>
         <w:tc>
           <w:tcPr>
-            <w:tcW w:w="2533" w:type="dxa"/>
+            <w:tcW w:w="1408" w:type="dxa"/>
             <w:tcBorders>
               <w:top w:val="single" w:sz="8" w:space="0" w:color="A3A3A3"/>
               <w:left w:val="single" w:sz="8" w:space="0" w:color="A3A3A3"/>
@@ -3241,7 +3258,7 @@
       <w:tr>
         <w:tc>
           <w:tcPr>
-            <w:tcW w:w="988" w:type="dxa"/>
+            <w:tcW w:w="1008" w:type="dxa"/>
             <w:tcBorders>
               <w:top w:val="single" w:sz="8" w:space="0" w:color="A3A3A3"/>
               <w:left w:val="single" w:sz="8" w:space="0" w:color="A3A3A3"/>
@@ -3279,7 +3296,7 @@
         </w:tc>
         <w:tc>
           <w:tcPr>
-            <w:tcW w:w="989" w:type="dxa"/>
+            <w:tcW w:w="180" w:type="dxa"/>
             <w:tcBorders>
               <w:top w:val="single" w:sz="8" w:space="0" w:color="A3A3A3"/>
               <w:left w:val="single" w:sz="8" w:space="0" w:color="A3A3A3"/>
@@ -3317,7 +3334,7 @@
         </w:tc>
         <w:tc>
           <w:tcPr>
-            <w:tcW w:w="1371" w:type="dxa"/>
+            <w:tcW w:w="1619" w:type="dxa"/>
             <w:tcBorders>
               <w:top w:val="single" w:sz="8" w:space="0" w:color="A3A3A3"/>
               <w:left w:val="single" w:sz="8" w:space="0" w:color="A3A3A3"/>
@@ -3355,7 +3372,7 @@
         </w:tc>
         <w:tc>
           <w:tcPr>
-            <w:tcW w:w="1868" w:type="dxa"/>
+            <w:tcW w:w="1308" w:type="dxa"/>
             <w:tcBorders>
               <w:top w:val="single" w:sz="8" w:space="0" w:color="A3A3A3"/>
               <w:left w:val="single" w:sz="8" w:space="0" w:color="A3A3A3"/>
@@ -3391,7 +3408,7 @@
         </w:tc>
         <w:tc>
           <w:tcPr>
-            <w:tcW w:w="2255" w:type="dxa"/>
+            <w:tcW w:w="1963" w:type="dxa"/>
             <w:tcBorders>
               <w:top w:val="single" w:sz="8" w:space="0" w:color="A3A3A3"/>
               <w:left w:val="single" w:sz="8" w:space="0" w:color="A3A3A3"/>
@@ -3427,7 +3444,7 @@
         </w:tc>
         <w:tc>
           <w:tcPr>
-            <w:tcW w:w="3613" w:type="dxa"/>
+            <w:tcW w:w="1744" w:type="dxa"/>
             <w:tcBorders>
               <w:top w:val="single" w:sz="8" w:space="0" w:color="A3A3A3"/>
               <w:left w:val="single" w:sz="8" w:space="0" w:color="A3A3A3"/>
@@ -3463,7 +3480,7 @@
         </w:tc>
         <w:tc>
           <w:tcPr>
-            <w:tcW w:w="2673" w:type="dxa"/>
+            <w:tcW w:w="1408" w:type="dxa"/>
             <w:tcBorders>
               <w:top w:val="single" w:sz="8" w:space="0" w:color="A3A3A3"/>
               <w:left w:val="single" w:sz="8" w:space="0" w:color="A3A3A3"/>
@@ -3501,7 +3518,7 @@
       <w:tr>
         <w:tc>
           <w:tcPr>
-            <w:tcW w:w="988" w:type="dxa"/>
+            <w:tcW w:w="1008" w:type="dxa"/>
             <w:tcBorders>
               <w:top w:val="single" w:sz="8" w:space="0" w:color="A3A3A3"/>
               <w:left w:val="single" w:sz="8" w:space="0" w:color="A3A3A3"/>
@@ -3539,7 +3556,7 @@
         </w:tc>
         <w:tc>
           <w:tcPr>
-            <w:tcW w:w="989" w:type="dxa"/>
+            <w:tcW w:w="180" w:type="dxa"/>
             <w:tcBorders>
               <w:top w:val="single" w:sz="8" w:space="0" w:color="A3A3A3"/>
               <w:left w:val="single" w:sz="8" w:space="0" w:color="A3A3A3"/>
@@ -3577,7 +3594,7 @@
         </w:tc>
         <w:tc>
           <w:tcPr>
-            <w:tcW w:w="1344" w:type="dxa"/>
+            <w:tcW w:w="1619" w:type="dxa"/>
             <w:tcBorders>
               <w:top w:val="single" w:sz="8" w:space="0" w:color="A3A3A3"/>
               <w:left w:val="single" w:sz="8" w:space="0" w:color="A3A3A3"/>
@@ -3627,7 +3644,7 @@
         </w:tc>
         <w:tc>
           <w:tcPr>
-            <w:tcW w:w="1876" w:type="dxa"/>
+            <w:tcW w:w="1308" w:type="dxa"/>
             <w:tcBorders>
               <w:top w:val="single" w:sz="8" w:space="0" w:color="A3A3A3"/>
               <w:left w:val="single" w:sz="8" w:space="0" w:color="A3A3A3"/>
@@ -3681,7 +3698,7 @@
         </w:tc>
         <w:tc>
           <w:tcPr>
-            <w:tcW w:w="2255" w:type="dxa"/>
+            <w:tcW w:w="1963" w:type="dxa"/>
             <w:tcBorders>
               <w:top w:val="single" w:sz="8" w:space="0" w:color="A3A3A3"/>
               <w:left w:val="single" w:sz="8" w:space="0" w:color="A3A3A3"/>
@@ -3717,7 +3734,7 @@
         </w:tc>
         <w:tc>
           <w:tcPr>
-            <w:tcW w:w="3613" w:type="dxa"/>
+            <w:tcW w:w="1744" w:type="dxa"/>
             <w:tcBorders>
               <w:top w:val="single" w:sz="8" w:space="0" w:color="A3A3A3"/>
               <w:left w:val="single" w:sz="8" w:space="0" w:color="A3A3A3"/>
@@ -3753,7 +3770,7 @@
         </w:tc>
         <w:tc>
           <w:tcPr>
-            <w:tcW w:w="2533" w:type="dxa"/>
+            <w:tcW w:w="1408" w:type="dxa"/>
             <w:tcBorders>
               <w:top w:val="single" w:sz="8" w:space="0" w:color="A3A3A3"/>
               <w:left w:val="single" w:sz="8" w:space="0" w:color="A3A3A3"/>
@@ -3801,7 +3818,7 @@
       <w:tr>
         <w:tc>
           <w:tcPr>
-            <w:tcW w:w="988" w:type="dxa"/>
+            <w:tcW w:w="1008" w:type="dxa"/>
             <w:tcBorders>
               <w:top w:val="single" w:sz="8" w:space="0" w:color="A3A3A3"/>
               <w:left w:val="single" w:sz="8" w:space="0" w:color="A3A3A3"/>
@@ -3839,7 +3856,7 @@
         </w:tc>
         <w:tc>
           <w:tcPr>
-            <w:tcW w:w="989" w:type="dxa"/>
+            <w:tcW w:w="180" w:type="dxa"/>
             <w:tcBorders>
               <w:top w:val="single" w:sz="8" w:space="0" w:color="A3A3A3"/>
               <w:left w:val="single" w:sz="8" w:space="0" w:color="A3A3A3"/>
@@ -3877,7 +3894,7 @@
         </w:tc>
         <w:tc>
           <w:tcPr>
-            <w:tcW w:w="1344" w:type="dxa"/>
+            <w:tcW w:w="1619" w:type="dxa"/>
             <w:tcBorders>
               <w:top w:val="single" w:sz="8" w:space="0" w:color="A3A3A3"/>
               <w:left w:val="single" w:sz="8" w:space="0" w:color="A3A3A3"/>
@@ -3915,7 +3932,7 @@
         </w:tc>
         <w:tc>
           <w:tcPr>
-            <w:tcW w:w="1868" w:type="dxa"/>
+            <w:tcW w:w="1308" w:type="dxa"/>
             <w:tcBorders>
               <w:top w:val="single" w:sz="8" w:space="0" w:color="A3A3A3"/>
               <w:left w:val="single" w:sz="8" w:space="0" w:color="A3A3A3"/>
@@ -3951,7 +3968,7 @@
         </w:tc>
         <w:tc>
           <w:tcPr>
-            <w:tcW w:w="2255" w:type="dxa"/>
+            <w:tcW w:w="1963" w:type="dxa"/>
             <w:tcBorders>
               <w:top w:val="single" w:sz="8" w:space="0" w:color="A3A3A3"/>
               <w:left w:val="single" w:sz="8" w:space="0" w:color="A3A3A3"/>
@@ -4005,43 +4022,61 @@
         </w:tc>
         <w:tc>
           <w:tcPr>
-            <w:tcW w:w="3613" w:type="dxa"/>
-            <w:tcBorders>
-              <w:top w:val="single" w:sz="8" w:space="0" w:color="A3A3A3"/>
-              <w:left w:val="single" w:sz="8" w:space="0" w:color="A3A3A3"/>
-              <w:bottom w:val="single" w:sz="8" w:space="0" w:color="A3A3A3"/>
-              <w:right w:val="single" w:sz="8" w:space="0" w:color="A3A3A3"/>
-            </w:tcBorders>
-            <w:tcMar>
-              <w:top w:w="80" w:type="dxa"/>
-              <w:left w:w="80" w:type="dxa"/>
-              <w:bottom w:w="80" w:type="dxa"/>
-              <w:right w:w="80" w:type="dxa"/>
-            </w:tcMar>
-            <w:hideMark/>
-          </w:tcPr>
-          <w:p>
-            <w:pPr>
-              <w:spacing w:after="0"/>
-              <w:rPr>
-                <w:rFonts w:ascii="Calibri" w:hAnsi="Calibri" w:cs="Calibri"/>
-                <w:sz w:val="22"/>
-                <w:szCs w:val="22"/>
-              </w:rPr>
-            </w:pPr>
-            <w:r>
-              <w:rPr>
-                <w:rFonts w:ascii="Calibri" w:hAnsi="Calibri" w:cs="Calibri"/>
-                <w:sz w:val="22"/>
-                <w:szCs w:val="22"/>
-              </w:rPr>
-              <w:t>Worker identifiziert und öffnet die aktuellste Datei.</w:t>
-            </w:r>
-          </w:p>
-        </w:tc>
-        <w:tc>
-          <w:tcPr>
-            <w:tcW w:w="2533" w:type="dxa"/>
+            <w:tcW w:w="1744" w:type="dxa"/>
+            <w:tcBorders>
+              <w:top w:val="single" w:sz="8" w:space="0" w:color="A3A3A3"/>
+              <w:left w:val="single" w:sz="8" w:space="0" w:color="A3A3A3"/>
+              <w:bottom w:val="single" w:sz="8" w:space="0" w:color="A3A3A3"/>
+              <w:right w:val="single" w:sz="8" w:space="0" w:color="A3A3A3"/>
+            </w:tcBorders>
+            <w:tcMar>
+              <w:top w:w="80" w:type="dxa"/>
+              <w:left w:w="80" w:type="dxa"/>
+              <w:bottom w:w="80" w:type="dxa"/>
+              <w:right w:w="80" w:type="dxa"/>
+            </w:tcMar>
+            <w:hideMark/>
+          </w:tcPr>
+          <w:p>
+            <w:pPr>
+              <w:spacing w:after="0"/>
+              <w:rPr>
+                <w:rFonts w:ascii="Calibri" w:hAnsi="Calibri" w:cs="Calibri"/>
+                <w:sz w:val="22"/>
+                <w:szCs w:val="22"/>
+              </w:rPr>
+            </w:pPr>
+            <w:r>
+              <w:rPr>
+                <w:rFonts w:ascii="Calibri" w:hAnsi="Calibri" w:cs="Calibri"/>
+                <w:sz w:val="22"/>
+                <w:szCs w:val="22"/>
+              </w:rPr>
+              <w:t xml:space="preserve">Worker identifiziert und öffnet die </w:t>
+            </w:r>
+            <w:proofErr w:type="gramStart"/>
+            <w:r>
+              <w:rPr>
+                <w:rFonts w:ascii="Calibri" w:hAnsi="Calibri" w:cs="Calibri"/>
+                <w:sz w:val="22"/>
+                <w:szCs w:val="22"/>
+              </w:rPr>
+              <w:t>aktuellste</w:t>
+            </w:r>
+            <w:proofErr w:type="gramEnd"/>
+            <w:r>
+              <w:rPr>
+                <w:rFonts w:ascii="Calibri" w:hAnsi="Calibri" w:cs="Calibri"/>
+                <w:sz w:val="22"/>
+                <w:szCs w:val="22"/>
+              </w:rPr>
+              <w:t xml:space="preserve"> Datei.</w:t>
+            </w:r>
+          </w:p>
+        </w:tc>
+        <w:tc>
+          <w:tcPr>
+            <w:tcW w:w="1408" w:type="dxa"/>
             <w:tcBorders>
               <w:top w:val="single" w:sz="8" w:space="0" w:color="A3A3A3"/>
               <w:left w:val="single" w:sz="8" w:space="0" w:color="A3A3A3"/>
@@ -4079,46 +4114,45 @@
       <w:tr>
         <w:tc>
           <w:tcPr>
-            <w:tcW w:w="988" w:type="dxa"/>
-            <w:tcBorders>
-              <w:top w:val="single" w:sz="8" w:space="0" w:color="A3A3A3"/>
-              <w:left w:val="single" w:sz="8" w:space="0" w:color="A3A3A3"/>
-              <w:bottom w:val="single" w:sz="8" w:space="0" w:color="A3A3A3"/>
-              <w:right w:val="single" w:sz="8" w:space="0" w:color="A3A3A3"/>
-            </w:tcBorders>
-            <w:tcMar>
-              <w:top w:w="80" w:type="dxa"/>
-              <w:left w:w="80" w:type="dxa"/>
-              <w:bottom w:w="80" w:type="dxa"/>
-              <w:right w:w="80" w:type="dxa"/>
-            </w:tcMar>
-            <w:hideMark/>
-          </w:tcPr>
-          <w:p>
-            <w:pPr>
-              <w:spacing w:after="0"/>
-              <w:rPr>
-                <w:rFonts w:ascii="Calibri" w:hAnsi="Calibri" w:cs="Calibri"/>
-                <w:sz w:val="22"/>
-                <w:szCs w:val="22"/>
-              </w:rPr>
-            </w:pPr>
-            <w:r>
-              <w:rPr>
-                <w:rFonts w:ascii="Calibri" w:hAnsi="Calibri" w:cs="Calibri"/>
-                <w:b/>
-                <w:bCs/>
-                <w:sz w:val="22"/>
-                <w:szCs w:val="22"/>
-              </w:rPr>
-              <w:lastRenderedPageBreak/>
+            <w:tcW w:w="1008" w:type="dxa"/>
+            <w:tcBorders>
+              <w:top w:val="single" w:sz="8" w:space="0" w:color="A3A3A3"/>
+              <w:left w:val="single" w:sz="8" w:space="0" w:color="A3A3A3"/>
+              <w:bottom w:val="single" w:sz="8" w:space="0" w:color="A3A3A3"/>
+              <w:right w:val="single" w:sz="8" w:space="0" w:color="A3A3A3"/>
+            </w:tcBorders>
+            <w:tcMar>
+              <w:top w:w="80" w:type="dxa"/>
+              <w:left w:w="80" w:type="dxa"/>
+              <w:bottom w:w="80" w:type="dxa"/>
+              <w:right w:w="80" w:type="dxa"/>
+            </w:tcMar>
+            <w:hideMark/>
+          </w:tcPr>
+          <w:p>
+            <w:pPr>
+              <w:spacing w:after="0"/>
+              <w:rPr>
+                <w:rFonts w:ascii="Calibri" w:hAnsi="Calibri" w:cs="Calibri"/>
+                <w:sz w:val="22"/>
+                <w:szCs w:val="22"/>
+              </w:rPr>
+            </w:pPr>
+            <w:r>
+              <w:rPr>
+                <w:rFonts w:ascii="Calibri" w:hAnsi="Calibri" w:cs="Calibri"/>
+                <w:b/>
+                <w:bCs/>
+                <w:sz w:val="22"/>
+                <w:szCs w:val="22"/>
+              </w:rPr>
               <w:t>T-W-13</w:t>
             </w:r>
           </w:p>
         </w:tc>
         <w:tc>
           <w:tcPr>
-            <w:tcW w:w="989" w:type="dxa"/>
+            <w:tcW w:w="180" w:type="dxa"/>
             <w:tcBorders>
               <w:top w:val="single" w:sz="8" w:space="0" w:color="A3A3A3"/>
               <w:left w:val="single" w:sz="8" w:space="0" w:color="A3A3A3"/>
@@ -4156,7 +4190,7 @@
         </w:tc>
         <w:tc>
           <w:tcPr>
-            <w:tcW w:w="1371" w:type="dxa"/>
+            <w:tcW w:w="1619" w:type="dxa"/>
             <w:tcBorders>
               <w:top w:val="single" w:sz="8" w:space="0" w:color="A3A3A3"/>
               <w:left w:val="single" w:sz="8" w:space="0" w:color="A3A3A3"/>
@@ -4194,7 +4228,7 @@
         </w:tc>
         <w:tc>
           <w:tcPr>
-            <w:tcW w:w="1868" w:type="dxa"/>
+            <w:tcW w:w="1308" w:type="dxa"/>
             <w:tcBorders>
               <w:top w:val="single" w:sz="8" w:space="0" w:color="A3A3A3"/>
               <w:left w:val="single" w:sz="8" w:space="0" w:color="A3A3A3"/>
@@ -4230,7 +4264,7 @@
         </w:tc>
         <w:tc>
           <w:tcPr>
-            <w:tcW w:w="2255" w:type="dxa"/>
+            <w:tcW w:w="1963" w:type="dxa"/>
             <w:tcBorders>
               <w:top w:val="single" w:sz="8" w:space="0" w:color="A3A3A3"/>
               <w:left w:val="single" w:sz="8" w:space="0" w:color="A3A3A3"/>
@@ -4266,7 +4300,7 @@
         </w:tc>
         <w:tc>
           <w:tcPr>
-            <w:tcW w:w="3613" w:type="dxa"/>
+            <w:tcW w:w="1744" w:type="dxa"/>
             <w:tcBorders>
               <w:top w:val="single" w:sz="8" w:space="0" w:color="A3A3A3"/>
               <w:left w:val="single" w:sz="8" w:space="0" w:color="A3A3A3"/>
@@ -4302,7 +4336,7 @@
         </w:tc>
         <w:tc>
           <w:tcPr>
-            <w:tcW w:w="2533" w:type="dxa"/>
+            <w:tcW w:w="1408" w:type="dxa"/>
             <w:tcBorders>
               <w:top w:val="single" w:sz="8" w:space="0" w:color="A3A3A3"/>
               <w:left w:val="single" w:sz="8" w:space="0" w:color="A3A3A3"/>
@@ -4340,7 +4374,7 @@
       <w:tr>
         <w:tc>
           <w:tcPr>
-            <w:tcW w:w="988" w:type="dxa"/>
+            <w:tcW w:w="1008" w:type="dxa"/>
             <w:tcBorders>
               <w:top w:val="single" w:sz="8" w:space="0" w:color="A3A3A3"/>
               <w:left w:val="single" w:sz="8" w:space="0" w:color="A3A3A3"/>
@@ -4378,7 +4412,7 @@
         </w:tc>
         <w:tc>
           <w:tcPr>
-            <w:tcW w:w="989" w:type="dxa"/>
+            <w:tcW w:w="180" w:type="dxa"/>
             <w:tcBorders>
               <w:top w:val="single" w:sz="8" w:space="0" w:color="A3A3A3"/>
               <w:left w:val="single" w:sz="8" w:space="0" w:color="A3A3A3"/>
@@ -4416,7 +4450,7 @@
         </w:tc>
         <w:tc>
           <w:tcPr>
-            <w:tcW w:w="1344" w:type="dxa"/>
+            <w:tcW w:w="1619" w:type="dxa"/>
             <w:tcBorders>
               <w:top w:val="single" w:sz="8" w:space="0" w:color="A3A3A3"/>
               <w:left w:val="single" w:sz="8" w:space="0" w:color="A3A3A3"/>
@@ -4454,7 +4488,7 @@
         </w:tc>
         <w:tc>
           <w:tcPr>
-            <w:tcW w:w="1871" w:type="dxa"/>
+            <w:tcW w:w="1308" w:type="dxa"/>
             <w:tcBorders>
               <w:top w:val="single" w:sz="8" w:space="0" w:color="A3A3A3"/>
               <w:left w:val="single" w:sz="8" w:space="0" w:color="A3A3A3"/>
@@ -4490,7 +4524,7 @@
         </w:tc>
         <w:tc>
           <w:tcPr>
-            <w:tcW w:w="2284" w:type="dxa"/>
+            <w:tcW w:w="1963" w:type="dxa"/>
             <w:tcBorders>
               <w:top w:val="single" w:sz="8" w:space="0" w:color="A3A3A3"/>
               <w:left w:val="single" w:sz="8" w:space="0" w:color="A3A3A3"/>
@@ -4526,7 +4560,7 @@
         </w:tc>
         <w:tc>
           <w:tcPr>
-            <w:tcW w:w="3613" w:type="dxa"/>
+            <w:tcW w:w="1744" w:type="dxa"/>
             <w:tcBorders>
               <w:top w:val="single" w:sz="8" w:space="0" w:color="A3A3A3"/>
               <w:left w:val="single" w:sz="8" w:space="0" w:color="A3A3A3"/>
@@ -4562,7 +4596,7 @@
         </w:tc>
         <w:tc>
           <w:tcPr>
-            <w:tcW w:w="2533" w:type="dxa"/>
+            <w:tcW w:w="1408" w:type="dxa"/>
             <w:tcBorders>
               <w:top w:val="single" w:sz="8" w:space="0" w:color="A3A3A3"/>
               <w:left w:val="single" w:sz="8" w:space="0" w:color="A3A3A3"/>
@@ -4600,7 +4634,7 @@
       <w:tr>
         <w:tc>
           <w:tcPr>
-            <w:tcW w:w="988" w:type="dxa"/>
+            <w:tcW w:w="1008" w:type="dxa"/>
             <w:tcBorders>
               <w:top w:val="single" w:sz="8" w:space="0" w:color="A3A3A3"/>
               <w:left w:val="single" w:sz="8" w:space="0" w:color="A3A3A3"/>
@@ -4638,7 +4672,7 @@
         </w:tc>
         <w:tc>
           <w:tcPr>
-            <w:tcW w:w="989" w:type="dxa"/>
+            <w:tcW w:w="180" w:type="dxa"/>
             <w:tcBorders>
               <w:top w:val="single" w:sz="8" w:space="0" w:color="A3A3A3"/>
               <w:left w:val="single" w:sz="8" w:space="0" w:color="A3A3A3"/>
@@ -4676,7 +4710,7 @@
         </w:tc>
         <w:tc>
           <w:tcPr>
-            <w:tcW w:w="1344" w:type="dxa"/>
+            <w:tcW w:w="1619" w:type="dxa"/>
             <w:tcBorders>
               <w:top w:val="single" w:sz="8" w:space="0" w:color="A3A3A3"/>
               <w:left w:val="single" w:sz="8" w:space="0" w:color="A3A3A3"/>
@@ -4736,7 +4770,7 @@
         </w:tc>
         <w:tc>
           <w:tcPr>
-            <w:tcW w:w="1868" w:type="dxa"/>
+            <w:tcW w:w="1308" w:type="dxa"/>
             <w:tcBorders>
               <w:top w:val="single" w:sz="8" w:space="0" w:color="A3A3A3"/>
               <w:left w:val="single" w:sz="8" w:space="0" w:color="A3A3A3"/>
@@ -4772,7 +4806,7 @@
         </w:tc>
         <w:tc>
           <w:tcPr>
-            <w:tcW w:w="2255" w:type="dxa"/>
+            <w:tcW w:w="1963" w:type="dxa"/>
             <w:tcBorders>
               <w:top w:val="single" w:sz="8" w:space="0" w:color="A3A3A3"/>
               <w:left w:val="single" w:sz="8" w:space="0" w:color="A3A3A3"/>
@@ -4826,7 +4860,7 @@
         </w:tc>
         <w:tc>
           <w:tcPr>
-            <w:tcW w:w="3613" w:type="dxa"/>
+            <w:tcW w:w="1744" w:type="dxa"/>
             <w:tcBorders>
               <w:top w:val="single" w:sz="8" w:space="0" w:color="A3A3A3"/>
               <w:left w:val="single" w:sz="8" w:space="0" w:color="A3A3A3"/>
@@ -4862,7 +4896,7 @@
         </w:tc>
         <w:tc>
           <w:tcPr>
-            <w:tcW w:w="2533" w:type="dxa"/>
+            <w:tcW w:w="1408" w:type="dxa"/>
             <w:tcBorders>
               <w:top w:val="single" w:sz="8" w:space="0" w:color="A3A3A3"/>
               <w:left w:val="single" w:sz="8" w:space="0" w:color="A3A3A3"/>
@@ -4900,45 +4934,46 @@
       <w:tr>
         <w:tc>
           <w:tcPr>
-            <w:tcW w:w="988" w:type="dxa"/>
-            <w:tcBorders>
-              <w:top w:val="single" w:sz="8" w:space="0" w:color="A3A3A3"/>
-              <w:left w:val="single" w:sz="8" w:space="0" w:color="A3A3A3"/>
-              <w:bottom w:val="single" w:sz="8" w:space="0" w:color="A3A3A3"/>
-              <w:right w:val="single" w:sz="8" w:space="0" w:color="A3A3A3"/>
-            </w:tcBorders>
-            <w:tcMar>
-              <w:top w:w="80" w:type="dxa"/>
-              <w:left w:w="80" w:type="dxa"/>
-              <w:bottom w:w="80" w:type="dxa"/>
-              <w:right w:w="80" w:type="dxa"/>
-            </w:tcMar>
-            <w:hideMark/>
-          </w:tcPr>
-          <w:p>
-            <w:pPr>
-              <w:spacing w:after="0"/>
-              <w:rPr>
-                <w:rFonts w:ascii="Calibri" w:hAnsi="Calibri" w:cs="Calibri"/>
-                <w:sz w:val="22"/>
-                <w:szCs w:val="22"/>
-              </w:rPr>
-            </w:pPr>
-            <w:r>
-              <w:rPr>
-                <w:rFonts w:ascii="Calibri" w:hAnsi="Calibri" w:cs="Calibri"/>
-                <w:b/>
-                <w:bCs/>
-                <w:sz w:val="22"/>
-                <w:szCs w:val="22"/>
-              </w:rPr>
+            <w:tcW w:w="1008" w:type="dxa"/>
+            <w:tcBorders>
+              <w:top w:val="single" w:sz="8" w:space="0" w:color="A3A3A3"/>
+              <w:left w:val="single" w:sz="8" w:space="0" w:color="A3A3A3"/>
+              <w:bottom w:val="single" w:sz="8" w:space="0" w:color="A3A3A3"/>
+              <w:right w:val="single" w:sz="8" w:space="0" w:color="A3A3A3"/>
+            </w:tcBorders>
+            <w:tcMar>
+              <w:top w:w="80" w:type="dxa"/>
+              <w:left w:w="80" w:type="dxa"/>
+              <w:bottom w:w="80" w:type="dxa"/>
+              <w:right w:w="80" w:type="dxa"/>
+            </w:tcMar>
+            <w:hideMark/>
+          </w:tcPr>
+          <w:p>
+            <w:pPr>
+              <w:spacing w:after="0"/>
+              <w:rPr>
+                <w:rFonts w:ascii="Calibri" w:hAnsi="Calibri" w:cs="Calibri"/>
+                <w:sz w:val="22"/>
+                <w:szCs w:val="22"/>
+              </w:rPr>
+            </w:pPr>
+            <w:r>
+              <w:rPr>
+                <w:rFonts w:ascii="Calibri" w:hAnsi="Calibri" w:cs="Calibri"/>
+                <w:b/>
+                <w:bCs/>
+                <w:sz w:val="22"/>
+                <w:szCs w:val="22"/>
+              </w:rPr>
+              <w:lastRenderedPageBreak/>
               <w:t>T-W-16</w:t>
             </w:r>
           </w:p>
         </w:tc>
         <w:tc>
           <w:tcPr>
-            <w:tcW w:w="989" w:type="dxa"/>
+            <w:tcW w:w="180" w:type="dxa"/>
             <w:tcBorders>
               <w:top w:val="single" w:sz="8" w:space="0" w:color="A3A3A3"/>
               <w:left w:val="single" w:sz="8" w:space="0" w:color="A3A3A3"/>
@@ -4976,45 +5011,57 @@
         </w:tc>
         <w:tc>
           <w:tcPr>
-            <w:tcW w:w="1344" w:type="dxa"/>
-            <w:tcBorders>
-              <w:top w:val="single" w:sz="8" w:space="0" w:color="A3A3A3"/>
-              <w:left w:val="single" w:sz="8" w:space="0" w:color="A3A3A3"/>
-              <w:bottom w:val="single" w:sz="8" w:space="0" w:color="A3A3A3"/>
-              <w:right w:val="single" w:sz="8" w:space="0" w:color="A3A3A3"/>
-            </w:tcBorders>
-            <w:tcMar>
-              <w:top w:w="80" w:type="dxa"/>
-              <w:left w:w="80" w:type="dxa"/>
-              <w:bottom w:w="80" w:type="dxa"/>
-              <w:right w:w="80" w:type="dxa"/>
-            </w:tcMar>
-            <w:hideMark/>
-          </w:tcPr>
-          <w:p>
-            <w:pPr>
-              <w:spacing w:after="0"/>
-              <w:rPr>
-                <w:rFonts w:ascii="Calibri" w:hAnsi="Calibri" w:cs="Calibri"/>
-                <w:sz w:val="22"/>
-                <w:szCs w:val="22"/>
-              </w:rPr>
-            </w:pPr>
-            <w:r>
-              <w:rPr>
-                <w:rFonts w:ascii="Calibri" w:hAnsi="Calibri" w:cs="Calibri"/>
-                <w:b/>
-                <w:bCs/>
-                <w:sz w:val="22"/>
-                <w:szCs w:val="22"/>
-              </w:rPr>
-              <w:t>Cool Off</w:t>
-            </w:r>
-          </w:p>
-        </w:tc>
-        <w:tc>
-          <w:tcPr>
-            <w:tcW w:w="1868" w:type="dxa"/>
+            <w:tcW w:w="1619" w:type="dxa"/>
+            <w:tcBorders>
+              <w:top w:val="single" w:sz="8" w:space="0" w:color="A3A3A3"/>
+              <w:left w:val="single" w:sz="8" w:space="0" w:color="A3A3A3"/>
+              <w:bottom w:val="single" w:sz="8" w:space="0" w:color="A3A3A3"/>
+              <w:right w:val="single" w:sz="8" w:space="0" w:color="A3A3A3"/>
+            </w:tcBorders>
+            <w:tcMar>
+              <w:top w:w="80" w:type="dxa"/>
+              <w:left w:w="80" w:type="dxa"/>
+              <w:bottom w:w="80" w:type="dxa"/>
+              <w:right w:w="80" w:type="dxa"/>
+            </w:tcMar>
+            <w:hideMark/>
+          </w:tcPr>
+          <w:p>
+            <w:pPr>
+              <w:spacing w:after="0"/>
+              <w:rPr>
+                <w:rFonts w:ascii="Calibri" w:hAnsi="Calibri" w:cs="Calibri"/>
+                <w:sz w:val="22"/>
+                <w:szCs w:val="22"/>
+              </w:rPr>
+            </w:pPr>
+            <w:proofErr w:type="gramStart"/>
+            <w:r>
+              <w:rPr>
+                <w:rFonts w:ascii="Calibri" w:hAnsi="Calibri" w:cs="Calibri"/>
+                <w:b/>
+                <w:bCs/>
+                <w:sz w:val="22"/>
+                <w:szCs w:val="22"/>
+              </w:rPr>
+              <w:t>Cool</w:t>
+            </w:r>
+            <w:proofErr w:type="gramEnd"/>
+            <w:r>
+              <w:rPr>
+                <w:rFonts w:ascii="Calibri" w:hAnsi="Calibri" w:cs="Calibri"/>
+                <w:b/>
+                <w:bCs/>
+                <w:sz w:val="22"/>
+                <w:szCs w:val="22"/>
+              </w:rPr>
+              <w:t xml:space="preserve"> Off</w:t>
+            </w:r>
+          </w:p>
+        </w:tc>
+        <w:tc>
+          <w:tcPr>
+            <w:tcW w:w="1308" w:type="dxa"/>
             <w:tcBorders>
               <w:top w:val="single" w:sz="8" w:space="0" w:color="A3A3A3"/>
               <w:left w:val="single" w:sz="8" w:space="0" w:color="A3A3A3"/>
@@ -5060,7 +5107,7 @@
         </w:tc>
         <w:tc>
           <w:tcPr>
-            <w:tcW w:w="2269" w:type="dxa"/>
+            <w:tcW w:w="1963" w:type="dxa"/>
             <w:tcBorders>
               <w:top w:val="single" w:sz="8" w:space="0" w:color="A3A3A3"/>
               <w:left w:val="single" w:sz="8" w:space="0" w:color="A3A3A3"/>
@@ -5096,7 +5143,7 @@
         </w:tc>
         <w:tc>
           <w:tcPr>
-            <w:tcW w:w="3613" w:type="dxa"/>
+            <w:tcW w:w="1744" w:type="dxa"/>
             <w:tcBorders>
               <w:top w:val="single" w:sz="8" w:space="0" w:color="A3A3A3"/>
               <w:left w:val="single" w:sz="8" w:space="0" w:color="A3A3A3"/>
@@ -5132,7 +5179,7 @@
         </w:tc>
         <w:tc>
           <w:tcPr>
-            <w:tcW w:w="2533" w:type="dxa"/>
+            <w:tcW w:w="1408" w:type="dxa"/>
             <w:tcBorders>
               <w:top w:val="single" w:sz="8" w:space="0" w:color="A3A3A3"/>
               <w:left w:val="single" w:sz="8" w:space="0" w:color="A3A3A3"/>
@@ -5170,7 +5217,7 @@
       <w:tr>
         <w:tc>
           <w:tcPr>
-            <w:tcW w:w="988" w:type="dxa"/>
+            <w:tcW w:w="1008" w:type="dxa"/>
             <w:tcBorders>
               <w:top w:val="single" w:sz="8" w:space="0" w:color="A3A3A3"/>
               <w:left w:val="single" w:sz="8" w:space="0" w:color="A3A3A3"/>
@@ -5208,7 +5255,7 @@
         </w:tc>
         <w:tc>
           <w:tcPr>
-            <w:tcW w:w="989" w:type="dxa"/>
+            <w:tcW w:w="180" w:type="dxa"/>
             <w:tcBorders>
               <w:top w:val="single" w:sz="8" w:space="0" w:color="A3A3A3"/>
               <w:left w:val="single" w:sz="8" w:space="0" w:color="A3A3A3"/>
@@ -5246,7 +5293,7 @@
         </w:tc>
         <w:tc>
           <w:tcPr>
-            <w:tcW w:w="1345" w:type="dxa"/>
+            <w:tcW w:w="1619" w:type="dxa"/>
             <w:tcBorders>
               <w:top w:val="single" w:sz="8" w:space="0" w:color="A3A3A3"/>
               <w:left w:val="single" w:sz="8" w:space="0" w:color="A3A3A3"/>
@@ -5284,7 +5331,7 @@
         </w:tc>
         <w:tc>
           <w:tcPr>
-            <w:tcW w:w="1868" w:type="dxa"/>
+            <w:tcW w:w="1308" w:type="dxa"/>
             <w:tcBorders>
               <w:top w:val="single" w:sz="8" w:space="0" w:color="A3A3A3"/>
               <w:left w:val="single" w:sz="8" w:space="0" w:color="A3A3A3"/>
@@ -5320,7 +5367,7 @@
         </w:tc>
         <w:tc>
           <w:tcPr>
-            <w:tcW w:w="2255" w:type="dxa"/>
+            <w:tcW w:w="1963" w:type="dxa"/>
             <w:tcBorders>
               <w:top w:val="single" w:sz="8" w:space="0" w:color="A3A3A3"/>
               <w:left w:val="single" w:sz="8" w:space="0" w:color="A3A3A3"/>
@@ -5356,7 +5403,7 @@
         </w:tc>
         <w:tc>
           <w:tcPr>
-            <w:tcW w:w="3613" w:type="dxa"/>
+            <w:tcW w:w="1744" w:type="dxa"/>
             <w:tcBorders>
               <w:top w:val="single" w:sz="8" w:space="0" w:color="A3A3A3"/>
               <w:left w:val="single" w:sz="8" w:space="0" w:color="A3A3A3"/>
@@ -5392,7 +5439,7 @@
         </w:tc>
         <w:tc>
           <w:tcPr>
-            <w:tcW w:w="2540" w:type="dxa"/>
+            <w:tcW w:w="1408" w:type="dxa"/>
             <w:tcBorders>
               <w:top w:val="single" w:sz="8" w:space="0" w:color="A3A3A3"/>
               <w:left w:val="single" w:sz="8" w:space="0" w:color="A3A3A3"/>
@@ -5430,7 +5477,7 @@
       <w:tr>
         <w:tc>
           <w:tcPr>
-            <w:tcW w:w="988" w:type="dxa"/>
+            <w:tcW w:w="1008" w:type="dxa"/>
             <w:tcBorders>
               <w:top w:val="single" w:sz="8" w:space="0" w:color="A3A3A3"/>
               <w:left w:val="single" w:sz="8" w:space="0" w:color="A3A3A3"/>
@@ -5468,7 +5515,7 @@
         </w:tc>
         <w:tc>
           <w:tcPr>
-            <w:tcW w:w="989" w:type="dxa"/>
+            <w:tcW w:w="180" w:type="dxa"/>
             <w:tcBorders>
               <w:top w:val="single" w:sz="8" w:space="0" w:color="A3A3A3"/>
               <w:left w:val="single" w:sz="8" w:space="0" w:color="A3A3A3"/>
@@ -5506,7 +5553,7 @@
         </w:tc>
         <w:tc>
           <w:tcPr>
-            <w:tcW w:w="1371" w:type="dxa"/>
+            <w:tcW w:w="1619" w:type="dxa"/>
             <w:tcBorders>
               <w:top w:val="single" w:sz="8" w:space="0" w:color="A3A3A3"/>
               <w:left w:val="single" w:sz="8" w:space="0" w:color="A3A3A3"/>
@@ -5544,7 +5591,7 @@
         </w:tc>
         <w:tc>
           <w:tcPr>
-            <w:tcW w:w="1891" w:type="dxa"/>
+            <w:tcW w:w="1308" w:type="dxa"/>
             <w:tcBorders>
               <w:top w:val="single" w:sz="8" w:space="0" w:color="A3A3A3"/>
               <w:left w:val="single" w:sz="8" w:space="0" w:color="A3A3A3"/>
@@ -5580,7 +5627,7 @@
         </w:tc>
         <w:tc>
           <w:tcPr>
-            <w:tcW w:w="2255" w:type="dxa"/>
+            <w:tcW w:w="1963" w:type="dxa"/>
             <w:tcBorders>
               <w:top w:val="single" w:sz="8" w:space="0" w:color="A3A3A3"/>
               <w:left w:val="single" w:sz="8" w:space="0" w:color="A3A3A3"/>
@@ -5616,7 +5663,7 @@
         </w:tc>
         <w:tc>
           <w:tcPr>
-            <w:tcW w:w="3640" w:type="dxa"/>
+            <w:tcW w:w="1744" w:type="dxa"/>
             <w:tcBorders>
               <w:top w:val="single" w:sz="8" w:space="0" w:color="A3A3A3"/>
               <w:left w:val="single" w:sz="8" w:space="0" w:color="A3A3A3"/>
@@ -5688,7 +5735,7 @@
         </w:tc>
         <w:tc>
           <w:tcPr>
-            <w:tcW w:w="2533" w:type="dxa"/>
+            <w:tcW w:w="1408" w:type="dxa"/>
             <w:tcBorders>
               <w:top w:val="single" w:sz="8" w:space="0" w:color="A3A3A3"/>
               <w:left w:val="single" w:sz="8" w:space="0" w:color="A3A3A3"/>
@@ -5726,7 +5773,7 @@
       <w:tr>
         <w:tc>
           <w:tcPr>
-            <w:tcW w:w="988" w:type="dxa"/>
+            <w:tcW w:w="1008" w:type="dxa"/>
             <w:tcBorders>
               <w:top w:val="single" w:sz="8" w:space="0" w:color="A3A3A3"/>
               <w:left w:val="single" w:sz="8" w:space="0" w:color="A3A3A3"/>
@@ -5764,7 +5811,7 @@
         </w:tc>
         <w:tc>
           <w:tcPr>
-            <w:tcW w:w="989" w:type="dxa"/>
+            <w:tcW w:w="180" w:type="dxa"/>
             <w:tcBorders>
               <w:top w:val="single" w:sz="8" w:space="0" w:color="A3A3A3"/>
               <w:left w:val="single" w:sz="8" w:space="0" w:color="A3A3A3"/>
@@ -5802,7 +5849,7 @@
         </w:tc>
         <w:tc>
           <w:tcPr>
-            <w:tcW w:w="1371" w:type="dxa"/>
+            <w:tcW w:w="1619" w:type="dxa"/>
             <w:tcBorders>
               <w:top w:val="single" w:sz="8" w:space="0" w:color="A3A3A3"/>
               <w:left w:val="single" w:sz="8" w:space="0" w:color="A3A3A3"/>
@@ -5840,7 +5887,7 @@
         </w:tc>
         <w:tc>
           <w:tcPr>
-            <w:tcW w:w="1895" w:type="dxa"/>
+            <w:tcW w:w="1308" w:type="dxa"/>
             <w:tcBorders>
               <w:top w:val="single" w:sz="8" w:space="0" w:color="A3A3A3"/>
               <w:left w:val="single" w:sz="8" w:space="0" w:color="A3A3A3"/>
@@ -5876,7 +5923,7 @@
         </w:tc>
         <w:tc>
           <w:tcPr>
-            <w:tcW w:w="2255" w:type="dxa"/>
+            <w:tcW w:w="1963" w:type="dxa"/>
             <w:tcBorders>
               <w:top w:val="single" w:sz="8" w:space="0" w:color="A3A3A3"/>
               <w:left w:val="single" w:sz="8" w:space="0" w:color="A3A3A3"/>
@@ -5912,7 +5959,7 @@
         </w:tc>
         <w:tc>
           <w:tcPr>
-            <w:tcW w:w="3640" w:type="dxa"/>
+            <w:tcW w:w="1744" w:type="dxa"/>
             <w:tcBorders>
               <w:top w:val="single" w:sz="8" w:space="0" w:color="A3A3A3"/>
               <w:left w:val="single" w:sz="8" w:space="0" w:color="A3A3A3"/>
@@ -5966,7 +6013,7 @@
         </w:tc>
         <w:tc>
           <w:tcPr>
-            <w:tcW w:w="2533" w:type="dxa"/>
+            <w:tcW w:w="1408" w:type="dxa"/>
             <w:tcBorders>
               <w:top w:val="single" w:sz="8" w:space="0" w:color="A3A3A3"/>
               <w:left w:val="single" w:sz="8" w:space="0" w:color="A3A3A3"/>
@@ -6004,7 +6051,7 @@
       <w:tr>
         <w:tc>
           <w:tcPr>
-            <w:tcW w:w="988" w:type="dxa"/>
+            <w:tcW w:w="1008" w:type="dxa"/>
             <w:tcBorders>
               <w:top w:val="single" w:sz="8" w:space="0" w:color="A3A3A3"/>
               <w:left w:val="single" w:sz="8" w:space="0" w:color="A3A3A3"/>
@@ -6042,7 +6089,7 @@
         </w:tc>
         <w:tc>
           <w:tcPr>
-            <w:tcW w:w="989" w:type="dxa"/>
+            <w:tcW w:w="180" w:type="dxa"/>
             <w:tcBorders>
               <w:top w:val="single" w:sz="8" w:space="0" w:color="A3A3A3"/>
               <w:left w:val="single" w:sz="8" w:space="0" w:color="A3A3A3"/>
@@ -6080,7 +6127,7 @@
         </w:tc>
         <w:tc>
           <w:tcPr>
-            <w:tcW w:w="1371" w:type="dxa"/>
+            <w:tcW w:w="1619" w:type="dxa"/>
             <w:tcBorders>
               <w:top w:val="single" w:sz="8" w:space="0" w:color="A3A3A3"/>
               <w:left w:val="single" w:sz="8" w:space="0" w:color="A3A3A3"/>
@@ -6130,7 +6177,7 @@
         </w:tc>
         <w:tc>
           <w:tcPr>
-            <w:tcW w:w="1868" w:type="dxa"/>
+            <w:tcW w:w="1308" w:type="dxa"/>
             <w:tcBorders>
               <w:top w:val="single" w:sz="8" w:space="0" w:color="A3A3A3"/>
               <w:left w:val="single" w:sz="8" w:space="0" w:color="A3A3A3"/>
@@ -6184,7 +6231,7 @@
         </w:tc>
         <w:tc>
           <w:tcPr>
-            <w:tcW w:w="2255" w:type="dxa"/>
+            <w:tcW w:w="1963" w:type="dxa"/>
             <w:tcBorders>
               <w:top w:val="single" w:sz="8" w:space="0" w:color="A3A3A3"/>
               <w:left w:val="single" w:sz="8" w:space="0" w:color="A3A3A3"/>
@@ -6220,7 +6267,7 @@
         </w:tc>
         <w:tc>
           <w:tcPr>
-            <w:tcW w:w="3613" w:type="dxa"/>
+            <w:tcW w:w="1744" w:type="dxa"/>
             <w:tcBorders>
               <w:top w:val="single" w:sz="8" w:space="0" w:color="A3A3A3"/>
               <w:left w:val="single" w:sz="8" w:space="0" w:color="A3A3A3"/>
@@ -6256,7 +6303,7 @@
         </w:tc>
         <w:tc>
           <w:tcPr>
-            <w:tcW w:w="2533" w:type="dxa"/>
+            <w:tcW w:w="1408" w:type="dxa"/>
             <w:tcBorders>
               <w:top w:val="single" w:sz="8" w:space="0" w:color="A3A3A3"/>
               <w:left w:val="single" w:sz="8" w:space="0" w:color="A3A3A3"/>
@@ -6304,46 +6351,45 @@
       <w:tr>
         <w:tc>
           <w:tcPr>
-            <w:tcW w:w="988" w:type="dxa"/>
-            <w:tcBorders>
-              <w:top w:val="single" w:sz="8" w:space="0" w:color="A3A3A3"/>
-              <w:left w:val="single" w:sz="8" w:space="0" w:color="A3A3A3"/>
-              <w:bottom w:val="single" w:sz="8" w:space="0" w:color="A3A3A3"/>
-              <w:right w:val="single" w:sz="8" w:space="0" w:color="A3A3A3"/>
-            </w:tcBorders>
-            <w:tcMar>
-              <w:top w:w="80" w:type="dxa"/>
-              <w:left w:w="80" w:type="dxa"/>
-              <w:bottom w:w="80" w:type="dxa"/>
-              <w:right w:w="80" w:type="dxa"/>
-            </w:tcMar>
-            <w:hideMark/>
-          </w:tcPr>
-          <w:p>
-            <w:pPr>
-              <w:spacing w:after="0"/>
-              <w:rPr>
-                <w:rFonts w:ascii="Calibri" w:hAnsi="Calibri" w:cs="Calibri"/>
-                <w:sz w:val="22"/>
-                <w:szCs w:val="22"/>
-              </w:rPr>
-            </w:pPr>
-            <w:r>
-              <w:rPr>
-                <w:rFonts w:ascii="Calibri" w:hAnsi="Calibri" w:cs="Calibri"/>
-                <w:b/>
-                <w:bCs/>
-                <w:sz w:val="22"/>
-                <w:szCs w:val="22"/>
-              </w:rPr>
-              <w:lastRenderedPageBreak/>
+            <w:tcW w:w="1008" w:type="dxa"/>
+            <w:tcBorders>
+              <w:top w:val="single" w:sz="8" w:space="0" w:color="A3A3A3"/>
+              <w:left w:val="single" w:sz="8" w:space="0" w:color="A3A3A3"/>
+              <w:bottom w:val="single" w:sz="8" w:space="0" w:color="A3A3A3"/>
+              <w:right w:val="single" w:sz="8" w:space="0" w:color="A3A3A3"/>
+            </w:tcBorders>
+            <w:tcMar>
+              <w:top w:w="80" w:type="dxa"/>
+              <w:left w:w="80" w:type="dxa"/>
+              <w:bottom w:w="80" w:type="dxa"/>
+              <w:right w:w="80" w:type="dxa"/>
+            </w:tcMar>
+            <w:hideMark/>
+          </w:tcPr>
+          <w:p>
+            <w:pPr>
+              <w:spacing w:after="0"/>
+              <w:rPr>
+                <w:rFonts w:ascii="Calibri" w:hAnsi="Calibri" w:cs="Calibri"/>
+                <w:sz w:val="22"/>
+                <w:szCs w:val="22"/>
+              </w:rPr>
+            </w:pPr>
+            <w:r>
+              <w:rPr>
+                <w:rFonts w:ascii="Calibri" w:hAnsi="Calibri" w:cs="Calibri"/>
+                <w:b/>
+                <w:bCs/>
+                <w:sz w:val="22"/>
+                <w:szCs w:val="22"/>
+              </w:rPr>
               <w:t>T-W-21</w:t>
             </w:r>
           </w:p>
         </w:tc>
         <w:tc>
           <w:tcPr>
-            <w:tcW w:w="989" w:type="dxa"/>
+            <w:tcW w:w="180" w:type="dxa"/>
             <w:tcBorders>
               <w:top w:val="single" w:sz="8" w:space="0" w:color="A3A3A3"/>
               <w:left w:val="single" w:sz="8" w:space="0" w:color="A3A3A3"/>
@@ -6381,7 +6427,7 @@
         </w:tc>
         <w:tc>
           <w:tcPr>
-            <w:tcW w:w="1351" w:type="dxa"/>
+            <w:tcW w:w="1619" w:type="dxa"/>
             <w:tcBorders>
               <w:top w:val="single" w:sz="8" w:space="0" w:color="A3A3A3"/>
               <w:left w:val="single" w:sz="8" w:space="0" w:color="A3A3A3"/>
@@ -6421,7 +6467,7 @@
         </w:tc>
         <w:tc>
           <w:tcPr>
-            <w:tcW w:w="1868" w:type="dxa"/>
+            <w:tcW w:w="1308" w:type="dxa"/>
             <w:tcBorders>
               <w:top w:val="single" w:sz="8" w:space="0" w:color="A3A3A3"/>
               <w:left w:val="single" w:sz="8" w:space="0" w:color="A3A3A3"/>
@@ -6457,7 +6503,7 @@
         </w:tc>
         <w:tc>
           <w:tcPr>
-            <w:tcW w:w="2255" w:type="dxa"/>
+            <w:tcW w:w="1963" w:type="dxa"/>
             <w:tcBorders>
               <w:top w:val="single" w:sz="8" w:space="0" w:color="A3A3A3"/>
               <w:left w:val="single" w:sz="8" w:space="0" w:color="A3A3A3"/>
@@ -6493,7 +6539,7 @@
         </w:tc>
         <w:tc>
           <w:tcPr>
-            <w:tcW w:w="3613" w:type="dxa"/>
+            <w:tcW w:w="1744" w:type="dxa"/>
             <w:tcBorders>
               <w:top w:val="single" w:sz="8" w:space="0" w:color="A3A3A3"/>
               <w:left w:val="single" w:sz="8" w:space="0" w:color="A3A3A3"/>
@@ -6529,7 +6575,7 @@
         </w:tc>
         <w:tc>
           <w:tcPr>
-            <w:tcW w:w="2570" w:type="dxa"/>
+            <w:tcW w:w="1408" w:type="dxa"/>
             <w:tcBorders>
               <w:top w:val="single" w:sz="8" w:space="0" w:color="A3A3A3"/>
               <w:left w:val="single" w:sz="8" w:space="0" w:color="A3A3A3"/>
@@ -6567,7 +6613,7 @@
       <w:tr>
         <w:tc>
           <w:tcPr>
-            <w:tcW w:w="988" w:type="dxa"/>
+            <w:tcW w:w="1008" w:type="dxa"/>
             <w:tcBorders>
               <w:top w:val="single" w:sz="8" w:space="0" w:color="A3A3A3"/>
               <w:left w:val="single" w:sz="8" w:space="0" w:color="A3A3A3"/>
@@ -6605,7 +6651,7 @@
         </w:tc>
         <w:tc>
           <w:tcPr>
-            <w:tcW w:w="989" w:type="dxa"/>
+            <w:tcW w:w="180" w:type="dxa"/>
             <w:tcBorders>
               <w:top w:val="single" w:sz="8" w:space="0" w:color="A3A3A3"/>
               <w:left w:val="single" w:sz="8" w:space="0" w:color="A3A3A3"/>
@@ -6643,7 +6689,7 @@
         </w:tc>
         <w:tc>
           <w:tcPr>
-            <w:tcW w:w="1344" w:type="dxa"/>
+            <w:tcW w:w="1619" w:type="dxa"/>
             <w:tcBorders>
               <w:top w:val="single" w:sz="8" w:space="0" w:color="A3A3A3"/>
               <w:left w:val="single" w:sz="8" w:space="0" w:color="A3A3A3"/>
@@ -6715,7 +6761,7 @@
         </w:tc>
         <w:tc>
           <w:tcPr>
-            <w:tcW w:w="1895" w:type="dxa"/>
+            <w:tcW w:w="1308" w:type="dxa"/>
             <w:tcBorders>
               <w:top w:val="single" w:sz="8" w:space="0" w:color="A3A3A3"/>
               <w:left w:val="single" w:sz="8" w:space="0" w:color="A3A3A3"/>
@@ -6751,7 +6797,7 @@
         </w:tc>
         <w:tc>
           <w:tcPr>
-            <w:tcW w:w="2284" w:type="dxa"/>
+            <w:tcW w:w="1963" w:type="dxa"/>
             <w:tcBorders>
               <w:top w:val="single" w:sz="8" w:space="0" w:color="A3A3A3"/>
               <w:left w:val="single" w:sz="8" w:space="0" w:color="A3A3A3"/>
@@ -6787,7 +6833,7 @@
         </w:tc>
         <w:tc>
           <w:tcPr>
-            <w:tcW w:w="3613" w:type="dxa"/>
+            <w:tcW w:w="1744" w:type="dxa"/>
             <w:tcBorders>
               <w:top w:val="single" w:sz="8" w:space="0" w:color="A3A3A3"/>
               <w:left w:val="single" w:sz="8" w:space="0" w:color="A3A3A3"/>
@@ -6823,7 +6869,7 @@
         </w:tc>
         <w:tc>
           <w:tcPr>
-            <w:tcW w:w="2601" w:type="dxa"/>
+            <w:tcW w:w="1408" w:type="dxa"/>
             <w:tcBorders>
               <w:top w:val="single" w:sz="8" w:space="0" w:color="A3A3A3"/>
               <w:left w:val="single" w:sz="8" w:space="0" w:color="A3A3A3"/>
@@ -6861,7 +6907,7 @@
       <w:tr>
         <w:tc>
           <w:tcPr>
-            <w:tcW w:w="988" w:type="dxa"/>
+            <w:tcW w:w="1008" w:type="dxa"/>
             <w:tcBorders>
               <w:top w:val="single" w:sz="8" w:space="0" w:color="A3A3A3"/>
               <w:left w:val="single" w:sz="8" w:space="0" w:color="A3A3A3"/>
@@ -6899,7 +6945,7 @@
         </w:tc>
         <w:tc>
           <w:tcPr>
-            <w:tcW w:w="989" w:type="dxa"/>
+            <w:tcW w:w="180" w:type="dxa"/>
             <w:tcBorders>
               <w:top w:val="single" w:sz="8" w:space="0" w:color="A3A3A3"/>
               <w:left w:val="single" w:sz="8" w:space="0" w:color="A3A3A3"/>
@@ -6937,7 +6983,7 @@
         </w:tc>
         <w:tc>
           <w:tcPr>
-            <w:tcW w:w="1344" w:type="dxa"/>
+            <w:tcW w:w="1619" w:type="dxa"/>
             <w:tcBorders>
               <w:top w:val="single" w:sz="8" w:space="0" w:color="A3A3A3"/>
               <w:left w:val="single" w:sz="8" w:space="0" w:color="A3A3A3"/>
@@ -6975,7 +7021,7 @@
         </w:tc>
         <w:tc>
           <w:tcPr>
-            <w:tcW w:w="1868" w:type="dxa"/>
+            <w:tcW w:w="1308" w:type="dxa"/>
             <w:tcBorders>
               <w:top w:val="single" w:sz="8" w:space="0" w:color="A3A3A3"/>
               <w:left w:val="single" w:sz="8" w:space="0" w:color="A3A3A3"/>
@@ -7011,7 +7057,7 @@
         </w:tc>
         <w:tc>
           <w:tcPr>
-            <w:tcW w:w="2255" w:type="dxa"/>
+            <w:tcW w:w="1963" w:type="dxa"/>
             <w:tcBorders>
               <w:top w:val="single" w:sz="8" w:space="0" w:color="A3A3A3"/>
               <w:left w:val="single" w:sz="8" w:space="0" w:color="A3A3A3"/>
@@ -7065,7 +7111,7 @@
         </w:tc>
         <w:tc>
           <w:tcPr>
-            <w:tcW w:w="3613" w:type="dxa"/>
+            <w:tcW w:w="1744" w:type="dxa"/>
             <w:tcBorders>
               <w:top w:val="single" w:sz="8" w:space="0" w:color="A3A3A3"/>
               <w:left w:val="single" w:sz="8" w:space="0" w:color="A3A3A3"/>
@@ -7101,7 +7147,7 @@
         </w:tc>
         <w:tc>
           <w:tcPr>
-            <w:tcW w:w="2533" w:type="dxa"/>
+            <w:tcW w:w="1408" w:type="dxa"/>
             <w:tcBorders>
               <w:top w:val="single" w:sz="8" w:space="0" w:color="A3A3A3"/>
               <w:left w:val="single" w:sz="8" w:space="0" w:color="A3A3A3"/>
@@ -7139,7 +7185,7 @@
       <w:tr>
         <w:tc>
           <w:tcPr>
-            <w:tcW w:w="988" w:type="dxa"/>
+            <w:tcW w:w="1008" w:type="dxa"/>
             <w:tcBorders>
               <w:top w:val="single" w:sz="8" w:space="0" w:color="A3A3A3"/>
               <w:left w:val="single" w:sz="8" w:space="0" w:color="A3A3A3"/>
@@ -7177,7 +7223,7 @@
         </w:tc>
         <w:tc>
           <w:tcPr>
-            <w:tcW w:w="989" w:type="dxa"/>
+            <w:tcW w:w="180" w:type="dxa"/>
             <w:tcBorders>
               <w:top w:val="single" w:sz="8" w:space="0" w:color="A3A3A3"/>
               <w:left w:val="single" w:sz="8" w:space="0" w:color="A3A3A3"/>
@@ -7215,7 +7261,7 @@
         </w:tc>
         <w:tc>
           <w:tcPr>
-            <w:tcW w:w="1344" w:type="dxa"/>
+            <w:tcW w:w="1619" w:type="dxa"/>
             <w:tcBorders>
               <w:top w:val="single" w:sz="8" w:space="0" w:color="A3A3A3"/>
               <w:left w:val="single" w:sz="8" w:space="0" w:color="A3A3A3"/>
@@ -7253,7 +7299,7 @@
         </w:tc>
         <w:tc>
           <w:tcPr>
-            <w:tcW w:w="1868" w:type="dxa"/>
+            <w:tcW w:w="1308" w:type="dxa"/>
             <w:tcBorders>
               <w:top w:val="single" w:sz="8" w:space="0" w:color="A3A3A3"/>
               <w:left w:val="single" w:sz="8" w:space="0" w:color="A3A3A3"/>
@@ -7307,7 +7353,7 @@
         </w:tc>
         <w:tc>
           <w:tcPr>
-            <w:tcW w:w="2255" w:type="dxa"/>
+            <w:tcW w:w="1963" w:type="dxa"/>
             <w:tcBorders>
               <w:top w:val="single" w:sz="8" w:space="0" w:color="A3A3A3"/>
               <w:left w:val="single" w:sz="8" w:space="0" w:color="A3A3A3"/>
@@ -7343,7 +7389,7 @@
         </w:tc>
         <w:tc>
           <w:tcPr>
-            <w:tcW w:w="3640" w:type="dxa"/>
+            <w:tcW w:w="1744" w:type="dxa"/>
             <w:tcBorders>
               <w:top w:val="single" w:sz="8" w:space="0" w:color="A3A3A3"/>
               <w:left w:val="single" w:sz="8" w:space="0" w:color="A3A3A3"/>
@@ -7379,7 +7425,7 @@
         </w:tc>
         <w:tc>
           <w:tcPr>
-            <w:tcW w:w="2559" w:type="dxa"/>
+            <w:tcW w:w="1408" w:type="dxa"/>
             <w:tcBorders>
               <w:top w:val="single" w:sz="8" w:space="0" w:color="A3A3A3"/>
               <w:left w:val="single" w:sz="8" w:space="0" w:color="A3A3A3"/>
@@ -7417,7 +7463,7 @@
       <w:tr>
         <w:tc>
           <w:tcPr>
-            <w:tcW w:w="988" w:type="dxa"/>
+            <w:tcW w:w="1008" w:type="dxa"/>
             <w:tcBorders>
               <w:top w:val="single" w:sz="8" w:space="0" w:color="A3A3A3"/>
               <w:left w:val="single" w:sz="8" w:space="0" w:color="A3A3A3"/>
@@ -7455,7 +7501,7 @@
         </w:tc>
         <w:tc>
           <w:tcPr>
-            <w:tcW w:w="989" w:type="dxa"/>
+            <w:tcW w:w="180" w:type="dxa"/>
             <w:tcBorders>
               <w:top w:val="single" w:sz="8" w:space="0" w:color="A3A3A3"/>
               <w:left w:val="single" w:sz="8" w:space="0" w:color="A3A3A3"/>
@@ -7493,7 +7539,7 @@
         </w:tc>
         <w:tc>
           <w:tcPr>
-            <w:tcW w:w="1344" w:type="dxa"/>
+            <w:tcW w:w="1619" w:type="dxa"/>
             <w:tcBorders>
               <w:top w:val="single" w:sz="8" w:space="0" w:color="A3A3A3"/>
               <w:left w:val="single" w:sz="8" w:space="0" w:color="A3A3A3"/>
@@ -7543,7 +7589,7 @@
         </w:tc>
         <w:tc>
           <w:tcPr>
-            <w:tcW w:w="1868" w:type="dxa"/>
+            <w:tcW w:w="1308" w:type="dxa"/>
             <w:tcBorders>
               <w:top w:val="single" w:sz="8" w:space="0" w:color="A3A3A3"/>
               <w:left w:val="single" w:sz="8" w:space="0" w:color="A3A3A3"/>
@@ -7579,7 +7625,7 @@
         </w:tc>
         <w:tc>
           <w:tcPr>
-            <w:tcW w:w="2255" w:type="dxa"/>
+            <w:tcW w:w="1963" w:type="dxa"/>
             <w:tcBorders>
               <w:top w:val="single" w:sz="8" w:space="0" w:color="A3A3A3"/>
               <w:left w:val="single" w:sz="8" w:space="0" w:color="A3A3A3"/>
@@ -7615,7 +7661,7 @@
         </w:tc>
         <w:tc>
           <w:tcPr>
-            <w:tcW w:w="3613" w:type="dxa"/>
+            <w:tcW w:w="1744" w:type="dxa"/>
             <w:tcBorders>
               <w:top w:val="single" w:sz="8" w:space="0" w:color="A3A3A3"/>
               <w:left w:val="single" w:sz="8" w:space="0" w:color="A3A3A3"/>
@@ -7651,37 +7697,46 @@
         </w:tc>
         <w:tc>
           <w:tcPr>
-            <w:tcW w:w="2683" w:type="dxa"/>
-            <w:tcBorders>
-              <w:top w:val="single" w:sz="8" w:space="0" w:color="A3A3A3"/>
-              <w:left w:val="single" w:sz="8" w:space="0" w:color="A3A3A3"/>
-              <w:bottom w:val="single" w:sz="8" w:space="0" w:color="A3A3A3"/>
-              <w:right w:val="single" w:sz="8" w:space="0" w:color="A3A3A3"/>
-            </w:tcBorders>
-            <w:tcMar>
-              <w:top w:w="80" w:type="dxa"/>
-              <w:left w:w="80" w:type="dxa"/>
-              <w:bottom w:w="80" w:type="dxa"/>
-              <w:right w:w="80" w:type="dxa"/>
-            </w:tcMar>
-            <w:hideMark/>
-          </w:tcPr>
-          <w:p>
-            <w:pPr>
-              <w:spacing w:after="0"/>
-              <w:rPr>
-                <w:rFonts w:ascii="Calibri" w:hAnsi="Calibri" w:cs="Calibri"/>
-                <w:sz w:val="22"/>
-                <w:szCs w:val="22"/>
-              </w:rPr>
-            </w:pPr>
-            <w:r>
-              <w:rPr>
-                <w:rFonts w:ascii="Calibri" w:hAnsi="Calibri" w:cs="Calibri"/>
-                <w:sz w:val="22"/>
-                <w:szCs w:val="22"/>
-              </w:rPr>
-              <w:t>Herunterfahren während eines hängenden Netzwerk-Timeouts.</w:t>
+            <w:tcW w:w="1408" w:type="dxa"/>
+            <w:tcBorders>
+              <w:top w:val="single" w:sz="8" w:space="0" w:color="A3A3A3"/>
+              <w:left w:val="single" w:sz="8" w:space="0" w:color="A3A3A3"/>
+              <w:bottom w:val="single" w:sz="8" w:space="0" w:color="A3A3A3"/>
+              <w:right w:val="single" w:sz="8" w:space="0" w:color="A3A3A3"/>
+            </w:tcBorders>
+            <w:tcMar>
+              <w:top w:w="80" w:type="dxa"/>
+              <w:left w:w="80" w:type="dxa"/>
+              <w:bottom w:w="80" w:type="dxa"/>
+              <w:right w:w="80" w:type="dxa"/>
+            </w:tcMar>
+            <w:hideMark/>
+          </w:tcPr>
+          <w:p>
+            <w:pPr>
+              <w:spacing w:after="0"/>
+              <w:rPr>
+                <w:rFonts w:ascii="Calibri" w:hAnsi="Calibri" w:cs="Calibri"/>
+                <w:sz w:val="22"/>
+                <w:szCs w:val="22"/>
+              </w:rPr>
+            </w:pPr>
+            <w:r>
+              <w:rPr>
+                <w:rFonts w:ascii="Calibri" w:hAnsi="Calibri" w:cs="Calibri"/>
+                <w:sz w:val="22"/>
+                <w:szCs w:val="22"/>
+              </w:rPr>
+              <w:t xml:space="preserve">Herunterfahren während eines hängenden </w:t>
+            </w:r>
+            <w:r>
+              <w:rPr>
+                <w:rFonts w:ascii="Calibri" w:hAnsi="Calibri" w:cs="Calibri"/>
+                <w:sz w:val="22"/>
+                <w:szCs w:val="22"/>
+              </w:rPr>
+              <w:lastRenderedPageBreak/>
+              <w:t>Netzwerk-Timeouts.</w:t>
             </w:r>
           </w:p>
         </w:tc>
@@ -8311,6 +8366,7 @@
   <w:style w:type="character" w:default="1" w:styleId="Absatz-Standardschriftart">
     <w:name w:val="Default Paragraph Font"/>
     <w:uiPriority w:val="1"/>
+    <w:semiHidden/>
     <w:unhideWhenUsed/>
   </w:style>
   <w:style w:type="table" w:default="1" w:styleId="NormaleTabelle">

</xml_diff>